<commit_message>
Affinage du booklet V3 sur l'asset audio du Blason de l'Aigle
</commit_message>
<xml_diff>
--- a/assets/Terre-de-Barons-TB7-Eagle-Crest-Lyrics-v3.docx
+++ b/assets/Terre-de-Barons-TB7-Eagle-Crest-Lyrics-v3.docx
@@ -11,22 +11,22 @@
           <w:noProof/>
         </w:rPr>
         <w:drawing>
-          <wp:anchor distT="0" distB="0" distL="114300" distR="114300" simplePos="0" relativeHeight="251658240" behindDoc="1" locked="0" layoutInCell="1" allowOverlap="1" wp14:anchorId="0320E9D5" wp14:editId="50101C0E">
+          <wp:anchor distT="0" distB="0" distL="114300" distR="114300" simplePos="0" relativeHeight="251658240" behindDoc="1" locked="0" layoutInCell="1" allowOverlap="1" wp14:anchorId="0320E9D5" wp14:editId="77B5E721">
             <wp:simplePos x="0" y="0"/>
             <wp:positionH relativeFrom="margin">
               <wp:align>left</wp:align>
             </wp:positionH>
             <wp:positionV relativeFrom="paragraph">
-              <wp:posOffset>5374</wp:posOffset>
+              <wp:posOffset>40943</wp:posOffset>
             </wp:positionV>
-            <wp:extent cx="1562100" cy="1562100"/>
-            <wp:effectExtent l="0" t="0" r="0" b="0"/>
+            <wp:extent cx="1193800" cy="1193800"/>
+            <wp:effectExtent l="0" t="0" r="6350" b="6350"/>
             <wp:wrapTight wrapText="bothSides">
               <wp:wrapPolygon edited="0">
                 <wp:start x="0" y="0"/>
-                <wp:lineTo x="0" y="21337"/>
-                <wp:lineTo x="21337" y="21337"/>
-                <wp:lineTo x="21337" y="0"/>
+                <wp:lineTo x="0" y="21370"/>
+                <wp:lineTo x="21370" y="21370"/>
+                <wp:lineTo x="21370" y="0"/>
                 <wp:lineTo x="0" y="0"/>
               </wp:wrapPolygon>
             </wp:wrapTight>
@@ -59,7 +59,7 @@
                   <pic:spPr bwMode="auto">
                     <a:xfrm>
                       <a:off x="0" y="0"/>
-                      <a:ext cx="1570962" cy="1570962"/>
+                      <a:ext cx="1206398" cy="1206398"/>
                     </a:xfrm>
                     <a:prstGeom prst="rect">
                       <a:avLst/>
@@ -86,10 +86,18 @@
           <w:b/>
           <w:bCs/>
         </w:rPr>
-        <w:t>Note sur la langue du chant –</w:t>
-      </w:r>
-      <w:r>
-        <w:t xml:space="preserve"> Les paroles de cet hymne sont interprétées dans un occitan médiéval unifié. Le chant ayant été généré par une intelligence artificielle musicale, les détails concernant les particularités de ce lexique seigneurial sont expliqués à la fin de ce document, après les paroles.</w:t>
+        <w:t>Note sur la langue du chant</w:t>
+      </w:r>
+      <w:r>
+        <w:t xml:space="preserve"> – Les paroles de cet hymne sont interprétées dans un occitan médiéval unifié. L'interprétation musicale de ce chant n'est pas le fruit d'une génération automatique directe par une intelligence artificielle. Elle résulte d'un long processus de </w:t>
+      </w:r>
+      <w:proofErr w:type="spellStart"/>
+      <w:r>
+        <w:t>co-création</w:t>
+      </w:r>
+      <w:proofErr w:type="spellEnd"/>
+      <w:r>
+        <w:t xml:space="preserve"> assistée. Ce travail itératif et persévérant a d'abord visé à aligner les rendus linguistique et poétique sur la thématique seigneuriale, avant de modeler le rendu sonore pour obtenir entière satisfaction. Les détails concernant les particularités de ce lexique sont expliqués à la fin de ce document, après les paroles et leurs traductions.</w:t>
       </w:r>
     </w:p>
     <w:p>
@@ -105,29 +113,33 @@
           <w:bCs/>
           <w:lang w:val="en-US"/>
         </w:rPr>
-        <w:t>Note on the Song's Language –</w:t>
-      </w:r>
-      <w:r>
-        <w:rPr>
-          <w:lang w:val="en-US"/>
-        </w:rPr>
-        <w:t xml:space="preserve"> The lyrics of this hymn are performed in a unified medieval Occitan. As the vocals were generated by a musical artificial intelligence, details regarding the peculiarities of this seigneurial </w:t>
-      </w:r>
-      <w:proofErr w:type="spellStart"/>
+        <w:t>Note on the Song's Language</w:t>
+      </w:r>
+      <w:r>
+        <w:rPr>
+          <w:lang w:val="en-US"/>
+        </w:rPr>
+        <w:t xml:space="preserve"> – The lyrics of this hymn are performed in a unified medieval Occitan. The musical performance of this song is not the result of direct automatic generation by </w:t>
+      </w:r>
       <w:proofErr w:type="gramStart"/>
       <w:r>
         <w:rPr>
           <w:lang w:val="en-US"/>
         </w:rPr>
-        <w:t>lexicon,are</w:t>
-      </w:r>
-      <w:proofErr w:type="spellEnd"/>
+        <w:t>an artificial</w:t>
+      </w:r>
       <w:proofErr w:type="gramEnd"/>
       <w:r>
         <w:rPr>
           <w:lang w:val="en-US"/>
         </w:rPr>
-        <w:t xml:space="preserve"> explained at the end of this document, after the lyrics.</w:t>
+        <w:t xml:space="preserve"> intelligence. It results from a long process of assisted co-creation. This iterative and persistent work first aimed to align the linguistic and poetic renderings with the seigneurial theme, before shaping the sound rendering to achieve full satisfaction. Details regarding the specific features of this lexicon are explained at the end of this document, after the lyrics and their translations.</w:t>
+      </w:r>
+      <w:r>
+        <w:rPr>
+          <w:noProof/>
+        </w:rPr>
+        <w:t xml:space="preserve"> </w:t>
       </w:r>
     </w:p>
     <w:p>
@@ -1064,6 +1076,7 @@
                 <w:bCs/>
                 <w:lang w:val="oc-FR"/>
               </w:rPr>
+              <w:lastRenderedPageBreak/>
               <w:t>La clòcha canta, lo vent que gronhís.</w:t>
             </w:r>
           </w:p>
@@ -1174,7 +1187,6 @@
                 <w:bCs/>
                 <w:lang w:val="oc-FR"/>
               </w:rPr>
-              <w:lastRenderedPageBreak/>
               <w:t>Topazi clar, jos la luna novèla.</w:t>
             </w:r>
           </w:p>
@@ -2084,10 +2096,24 @@
     </w:p>
     <w:p>
       <w:pPr>
+        <w:rPr>
+          <w:rFonts w:asciiTheme="majorHAnsi" w:eastAsiaTheme="majorEastAsia" w:hAnsiTheme="majorHAnsi" w:cstheme="majorBidi"/>
+          <w:color w:val="0F4761" w:themeColor="accent1" w:themeShade="BF"/>
+          <w:sz w:val="40"/>
+          <w:szCs w:val="40"/>
+        </w:rPr>
+      </w:pPr>
+      <w:r>
+        <w:br w:type="page"/>
+      </w:r>
+    </w:p>
+    <w:p>
+      <w:pPr>
         <w:pStyle w:val="Titre1"/>
         <w:jc w:val="both"/>
       </w:pPr>
       <w:r>
+        <w:lastRenderedPageBreak/>
         <w:t>À propos de la langue et du texte</w:t>
       </w:r>
     </w:p>
@@ -2116,8 +2142,11 @@
       </w:r>
     </w:p>
     <w:p>
-      <w:r>
-        <w:br w:type="page"/>
+      <w:pPr>
+        <w:jc w:val="both"/>
+      </w:pPr>
+      <w:r>
+        <w:t>Voici les grands chantiers de cette réécriture :</w:t>
       </w:r>
     </w:p>
     <w:p>
@@ -2125,8 +2154,27 @@
         <w:jc w:val="both"/>
       </w:pPr>
       <w:r>
-        <w:lastRenderedPageBreak/>
-        <w:t>Voici les grands chantiers de cette réécriture :</w:t>
+        <w:rPr>
+          <w:b/>
+          <w:bCs/>
+        </w:rPr>
+        <w:t>1. La fin des rimes inventées ("Bronze" et "</w:t>
+      </w:r>
+      <w:proofErr w:type="spellStart"/>
+      <w:r>
+        <w:rPr>
+          <w:b/>
+          <w:bCs/>
+        </w:rPr>
+        <w:t>Gronze</w:t>
+      </w:r>
+      <w:proofErr w:type="spellEnd"/>
+      <w:r>
+        <w:rPr>
+          <w:b/>
+          <w:bCs/>
+        </w:rPr>
+        <w:t>")</w:t>
       </w:r>
     </w:p>
     <w:p>
@@ -2134,11 +2182,85 @@
         <w:jc w:val="both"/>
       </w:pPr>
       <w:r>
+        <w:t>Dans la V2, le second couplet tentait de faire rimer "flama de bronze" avec le vent qui "</w:t>
+      </w:r>
+      <w:proofErr w:type="spellStart"/>
+      <w:r>
+        <w:t>gronze</w:t>
+      </w:r>
+      <w:proofErr w:type="spellEnd"/>
+      <w:r>
+        <w:t xml:space="preserve">". Le problème ? Si </w:t>
+      </w:r>
+      <w:r>
+        <w:rPr>
+          <w:i/>
+          <w:iCs/>
+        </w:rPr>
+        <w:t>bronze</w:t>
+      </w:r>
+      <w:r>
+        <w:t xml:space="preserve"> est hors de propos pour un feu montagnard, le mot </w:t>
+      </w:r>
+      <w:proofErr w:type="spellStart"/>
+      <w:r>
+        <w:rPr>
+          <w:i/>
+          <w:iCs/>
+        </w:rPr>
+        <w:t>gronze</w:t>
+      </w:r>
+      <w:proofErr w:type="spellEnd"/>
+      <w:r>
+        <w:t xml:space="preserve"> n'existe tout simplement pas en occitan ! C'était un mot-valise inventé de toutes pièces pour forcer la rime avec </w:t>
+      </w:r>
+      <w:proofErr w:type="spellStart"/>
+      <w:r>
+        <w:rPr>
+          <w:i/>
+          <w:iCs/>
+        </w:rPr>
+        <w:t>gronhir</w:t>
+      </w:r>
+      <w:proofErr w:type="spellEnd"/>
+      <w:r>
+        <w:t xml:space="preserve"> (grogner). Nous avons balayé cette erreur en revenant à des verbes authentiques : la vallée </w:t>
+      </w:r>
+      <w:proofErr w:type="spellStart"/>
+      <w:r>
+        <w:rPr>
+          <w:i/>
+          <w:iCs/>
+        </w:rPr>
+        <w:t>ressonhís</w:t>
+      </w:r>
+      <w:proofErr w:type="spellEnd"/>
+      <w:r>
+        <w:t xml:space="preserve"> (résonne) et le vent </w:t>
+      </w:r>
+      <w:proofErr w:type="spellStart"/>
+      <w:r>
+        <w:rPr>
+          <w:i/>
+          <w:iCs/>
+        </w:rPr>
+        <w:t>gronhís</w:t>
+      </w:r>
+      <w:proofErr w:type="spellEnd"/>
+      <w:r>
+        <w:t xml:space="preserve"> (grogne), créant une assonance infiniment plus naturelle et féroce.</w:t>
+      </w:r>
+    </w:p>
+    <w:p>
+      <w:pPr>
+        <w:jc w:val="both"/>
+      </w:pPr>
+      <w:r>
         <w:rPr>
           <w:b/>
           <w:bCs/>
         </w:rPr>
-        <w:t>1. La fin des rimes inventées ("Bronze" et "</w:t>
+        <w:t xml:space="preserve">2. L'abandon des métaphores absurdes ("Vira la </w:t>
       </w:r>
       <w:proofErr w:type="spellStart"/>
       <w:r>
@@ -2146,7 +2268,7 @@
           <w:b/>
           <w:bCs/>
         </w:rPr>
-        <w:t>Gronze</w:t>
+        <w:t>vèira</w:t>
       </w:r>
       <w:proofErr w:type="spellEnd"/>
       <w:r>
@@ -2162,25 +2284,14 @@
         <w:jc w:val="both"/>
       </w:pPr>
       <w:r>
-        <w:t>Dans la V2, le second couplet tentait de faire rimer "flama de bronze" avec le vent qui "</w:t>
-      </w:r>
-      <w:proofErr w:type="spellStart"/>
-      <w:r>
-        <w:t>gronze</w:t>
-      </w:r>
-      <w:proofErr w:type="spellEnd"/>
-      <w:r>
-        <w:t xml:space="preserve">". Le problème ? Si </w:t>
+        <w:t xml:space="preserve">Pour décrire le vol de l'aigle, l'ancienne version utilisait l'expression </w:t>
       </w:r>
       <w:r>
         <w:rPr>
           <w:i/>
           <w:iCs/>
         </w:rPr>
-        <w:t>bronze</w:t>
-      </w:r>
-      <w:r>
-        <w:t xml:space="preserve"> est hors de propos pour un feu montagnard, le mot </w:t>
+        <w:t xml:space="preserve">vira la </w:t>
       </w:r>
       <w:proofErr w:type="spellStart"/>
       <w:r>
@@ -2188,23 +2299,26 @@
           <w:i/>
           <w:iCs/>
         </w:rPr>
-        <w:t>gronze</w:t>
+        <w:t>vèira</w:t>
       </w:r>
       <w:proofErr w:type="spellEnd"/>
       <w:r>
-        <w:t xml:space="preserve"> n'existe tout simplement pas en occitan ! C'était un mot-valise inventé de toutes pièces pour forcer la rime avec </w:t>
-      </w:r>
-      <w:proofErr w:type="spellStart"/>
+        <w:t xml:space="preserve"> (littéralement : </w:t>
+      </w:r>
+      <w:proofErr w:type="gramStart"/>
+      <w:r>
+        <w:t>"tourne la</w:t>
+      </w:r>
+      <w:proofErr w:type="gramEnd"/>
+      <w:r>
+        <w:t xml:space="preserve"> vitre/le verre"). Une tournure obscure et peu évocatrice pour un chant qui se veut clair. Nous l'avons remplacée par une image de surveillance attentive et de protection : </w:t>
+      </w:r>
       <w:r>
         <w:rPr>
           <w:i/>
           <w:iCs/>
         </w:rPr>
-        <w:t>gronhir</w:t>
-      </w:r>
-      <w:proofErr w:type="spellEnd"/>
-      <w:r>
-        <w:t xml:space="preserve"> (grogner). Nous avons balayé cette erreur en revenant à des verbes authentiques : la vallée </w:t>
+        <w:t xml:space="preserve">que las </w:t>
       </w:r>
       <w:proofErr w:type="spellStart"/>
       <w:r>
@@ -2212,11 +2326,31 @@
           <w:i/>
           <w:iCs/>
         </w:rPr>
-        <w:t>ressonhís</w:t>
+        <w:t>abraça</w:t>
       </w:r>
       <w:proofErr w:type="spellEnd"/>
       <w:r>
-        <w:t xml:space="preserve"> (résonne) et le vent </w:t>
+        <w:t xml:space="preserve"> (qui les embrasse). L'aigle ne se contente plus de survoler les montagnes ; il enveloppe la vallée de ses ailes protectrices. Cette étreinte aérienne n'est pas une prise de possession, mais un geste fort et solide, comparable aux bras d'un père veillant sur sa famille</w:t>
+      </w:r>
+    </w:p>
+    <w:p>
+      <w:pPr>
+        <w:jc w:val="both"/>
+      </w:pPr>
+      <w:r>
+        <w:rPr>
+          <w:b/>
+          <w:bCs/>
+        </w:rPr>
+        <w:t>3. Le renforcement des descriptions paysagères</w:t>
+      </w:r>
+    </w:p>
+    <w:p>
+      <w:pPr>
+        <w:jc w:val="both"/>
+      </w:pPr>
+      <w:r>
+        <w:t xml:space="preserve">L'introduction originale se contentait d'un </w:t>
       </w:r>
       <w:proofErr w:type="spellStart"/>
       <w:r>
@@ -2224,11 +2358,69 @@
           <w:i/>
           <w:iCs/>
         </w:rPr>
-        <w:t>gronhís</w:t>
+        <w:t>montanhas</w:t>
       </w:r>
       <w:proofErr w:type="spellEnd"/>
       <w:r>
-        <w:t xml:space="preserve"> (grogne), créant une assonance infiniment plus naturelle et féroce.</w:t>
+        <w:rPr>
+          <w:i/>
+          <w:iCs/>
+        </w:rPr>
+        <w:t xml:space="preserve"> de </w:t>
+      </w:r>
+      <w:proofErr w:type="spellStart"/>
+      <w:r>
+        <w:rPr>
+          <w:i/>
+          <w:iCs/>
+        </w:rPr>
+        <w:t>pèira</w:t>
+      </w:r>
+      <w:proofErr w:type="spellEnd"/>
+      <w:r>
+        <w:t xml:space="preserve"> (montagnes de pierre) un peu pauvre et purement descriptif. En le remplaçant par le diptyque </w:t>
+      </w:r>
+      <w:r>
+        <w:rPr>
+          <w:i/>
+          <w:iCs/>
+        </w:rPr>
+        <w:t xml:space="preserve">Cimas de </w:t>
+      </w:r>
+      <w:proofErr w:type="spellStart"/>
+      <w:r>
+        <w:rPr>
+          <w:i/>
+          <w:iCs/>
+        </w:rPr>
+        <w:t>nèbla</w:t>
+      </w:r>
+      <w:proofErr w:type="spellEnd"/>
+      <w:r>
+        <w:rPr>
+          <w:i/>
+          <w:iCs/>
+        </w:rPr>
+        <w:t xml:space="preserve">, </w:t>
+      </w:r>
+      <w:proofErr w:type="spellStart"/>
+      <w:r>
+        <w:rPr>
+          <w:i/>
+          <w:iCs/>
+        </w:rPr>
+        <w:t>valh</w:t>
+      </w:r>
+      <w:proofErr w:type="spellEnd"/>
+      <w:r>
+        <w:rPr>
+          <w:i/>
+          <w:iCs/>
+        </w:rPr>
+        <w:t xml:space="preserve"> de glaça</w:t>
+      </w:r>
+      <w:r>
+        <w:t xml:space="preserve"> (Cimes de brume, vallée de glace), le paysage s'habille et se pare noblement de ses éléments naturels.</w:t>
       </w:r>
     </w:p>
     <w:p>
@@ -2240,23 +2432,7 @@
           <w:b/>
           <w:bCs/>
         </w:rPr>
-        <w:t xml:space="preserve">2. L'abandon des métaphores absurdes ("Vira la </w:t>
-      </w:r>
-      <w:proofErr w:type="spellStart"/>
-      <w:r>
-        <w:rPr>
-          <w:b/>
-          <w:bCs/>
-        </w:rPr>
-        <w:t>vèira</w:t>
-      </w:r>
-      <w:proofErr w:type="spellEnd"/>
-      <w:r>
-        <w:rPr>
-          <w:b/>
-          <w:bCs/>
-        </w:rPr>
-        <w:t>")</w:t>
+        <w:t>4. D'un chant descriptif à un texte ancré dans le réel</w:t>
       </w:r>
     </w:p>
     <w:p>
@@ -2264,73 +2440,42 @@
         <w:jc w:val="both"/>
       </w:pPr>
       <w:r>
-        <w:t xml:space="preserve">Pour décrire le vol de l'aigle, l'ancienne version utilisait l'expression </w:t>
-      </w:r>
+        <w:t>Globalement, le travail a consisté à ancrer les paroles dans le vécu de ses habitants. Les gemmes évoquées (</w:t>
+      </w:r>
+      <w:proofErr w:type="spellStart"/>
       <w:r>
         <w:rPr>
           <w:i/>
           <w:iCs/>
         </w:rPr>
-        <w:t xml:space="preserve">vira la </w:t>
-      </w:r>
-      <w:proofErr w:type="spellStart"/>
+        <w:t>lutz</w:t>
+      </w:r>
+      <w:proofErr w:type="spellEnd"/>
       <w:r>
         <w:rPr>
           <w:i/>
           <w:iCs/>
         </w:rPr>
-        <w:t>vèira</w:t>
-      </w:r>
-      <w:proofErr w:type="spellEnd"/>
-      <w:r>
-        <w:t xml:space="preserve"> (littéralement : </w:t>
-      </w:r>
-      <w:proofErr w:type="gramStart"/>
-      <w:r>
-        <w:t>"tourne la</w:t>
-      </w:r>
-      <w:proofErr w:type="gramEnd"/>
-      <w:r>
-        <w:t xml:space="preserve"> vitre/le verre"). Une tournure bien trop osée et obscure pour un chant martial qui se doit d'être direct. Nous l'avons remplacée par une image de domination territoriale claire : </w:t>
-      </w:r>
+        <w:t xml:space="preserve"> de saphir</w:t>
+      </w:r>
+      <w:r>
+        <w:t xml:space="preserve">, </w:t>
+      </w:r>
+      <w:proofErr w:type="spellStart"/>
       <w:r>
         <w:rPr>
           <w:i/>
           <w:iCs/>
         </w:rPr>
-        <w:t xml:space="preserve">que las </w:t>
-      </w:r>
-      <w:proofErr w:type="spellStart"/>
+        <w:t>topazi</w:t>
+      </w:r>
+      <w:proofErr w:type="spellEnd"/>
       <w:r>
         <w:rPr>
           <w:i/>
           <w:iCs/>
         </w:rPr>
-        <w:t>abraça</w:t>
-      </w:r>
-      <w:proofErr w:type="spellEnd"/>
-      <w:r>
-        <w:t xml:space="preserve"> (qui les embrasse). L'aigle ne fait plus que voler ; il enveloppe et possède son domaine féodal du bout de ses ailes.</w:t>
-      </w:r>
-    </w:p>
-    <w:p>
-      <w:pPr>
-        <w:jc w:val="both"/>
-      </w:pPr>
-      <w:r>
-        <w:rPr>
-          <w:b/>
-          <w:bCs/>
-        </w:rPr>
-        <w:t>3. Le renforcement des descriptions paysagères</w:t>
-      </w:r>
-    </w:p>
-    <w:p>
-      <w:pPr>
-        <w:jc w:val="both"/>
-      </w:pPr>
-      <w:r>
-        <w:t xml:space="preserve">L'introduction originale se contentait d'un </w:t>
+        <w:t xml:space="preserve"> </w:t>
       </w:r>
       <w:proofErr w:type="spellStart"/>
       <w:r>
@@ -2338,168 +2483,43 @@
           <w:i/>
           <w:iCs/>
         </w:rPr>
-        <w:t>montanhas</w:t>
+        <w:t>clar</w:t>
       </w:r>
       <w:proofErr w:type="spellEnd"/>
       <w:r>
-        <w:rPr>
-          <w:i/>
-          <w:iCs/>
-        </w:rPr>
+        <w:t>) ne sont plus de simples cailloux qui brillent dans un torrent, elles sont directement comparées à l'équipement du chevalier ("l'</w:t>
+      </w:r>
+      <w:proofErr w:type="spellStart"/>
+      <w:r>
+        <w:t>òme</w:t>
+      </w:r>
+      <w:proofErr w:type="spellEnd"/>
+      <w:r>
         <w:t xml:space="preserve"> de </w:t>
       </w:r>
       <w:proofErr w:type="spellStart"/>
       <w:r>
-        <w:rPr>
-          <w:i/>
-          <w:iCs/>
-        </w:rPr>
-        <w:t>pèira</w:t>
+        <w:t>guèrra</w:t>
       </w:r>
       <w:proofErr w:type="spellEnd"/>
       <w:r>
-        <w:t xml:space="preserve"> (montagnes de pierre) un peu pauvre et descriptif. En le remplaçant par le diptyque </w:t>
-      </w:r>
-      <w:r>
-        <w:rPr>
-          <w:i/>
-          <w:iCs/>
-        </w:rPr>
-        <w:t xml:space="preserve">Cimas de </w:t>
+        <w:t>") et au regard d'une dame ("coma l'</w:t>
       </w:r>
       <w:proofErr w:type="spellStart"/>
       <w:r>
-        <w:rPr>
-          <w:i/>
-          <w:iCs/>
-        </w:rPr>
-        <w:t>nèbla</w:t>
+        <w:t>uèlh</w:t>
       </w:r>
       <w:proofErr w:type="spellEnd"/>
       <w:r>
-        <w:rPr>
-          <w:i/>
-          <w:iCs/>
-        </w:rPr>
-        <w:t xml:space="preserve">, </w:t>
+        <w:t xml:space="preserve"> de la </w:t>
       </w:r>
       <w:proofErr w:type="spellStart"/>
       <w:r>
-        <w:rPr>
-          <w:i/>
-          <w:iCs/>
-        </w:rPr>
-        <w:t>valh</w:t>
+        <w:t>damaisèla</w:t>
       </w:r>
       <w:proofErr w:type="spellEnd"/>
       <w:r>
-        <w:rPr>
-          <w:i/>
-          <w:iCs/>
-        </w:rPr>
-        <w:t xml:space="preserve"> de glaça</w:t>
-      </w:r>
-      <w:r>
-        <w:t xml:space="preserve"> (Cimes de brume, vallée de glace), le texte pose immédiatement une atmosphère dure, inhospitalière et mystique, digne de la forteresse d'un baron. Le paysage devient vivant.</w:t>
-      </w:r>
-    </w:p>
-    <w:p>
-      <w:pPr>
-        <w:jc w:val="both"/>
-      </w:pPr>
-      <w:r>
-        <w:rPr>
-          <w:b/>
-          <w:bCs/>
-        </w:rPr>
-        <w:t>4. D'un chant descriptif à un texte ancré dans le réel</w:t>
-      </w:r>
-    </w:p>
-    <w:p>
-      <w:pPr>
-        <w:jc w:val="both"/>
-      </w:pPr>
-      <w:r>
-        <w:t>Globalement, le travail a consisté à ancrer les paroles. Les gemmes évoquées (</w:t>
-      </w:r>
-      <w:proofErr w:type="spellStart"/>
-      <w:r>
-        <w:rPr>
-          <w:i/>
-          <w:iCs/>
-        </w:rPr>
-        <w:t>lutz</w:t>
-      </w:r>
-      <w:proofErr w:type="spellEnd"/>
-      <w:r>
-        <w:rPr>
-          <w:i/>
-          <w:iCs/>
-        </w:rPr>
-        <w:t xml:space="preserve"> de saphir</w:t>
-      </w:r>
-      <w:r>
-        <w:t xml:space="preserve">, </w:t>
-      </w:r>
-      <w:proofErr w:type="spellStart"/>
-      <w:r>
-        <w:rPr>
-          <w:i/>
-          <w:iCs/>
-        </w:rPr>
-        <w:t>topazi</w:t>
-      </w:r>
-      <w:proofErr w:type="spellEnd"/>
-      <w:r>
-        <w:rPr>
-          <w:i/>
-          <w:iCs/>
-        </w:rPr>
-        <w:t xml:space="preserve"> </w:t>
-      </w:r>
-      <w:proofErr w:type="spellStart"/>
-      <w:r>
-        <w:rPr>
-          <w:i/>
-          <w:iCs/>
-        </w:rPr>
-        <w:t>clar</w:t>
-      </w:r>
-      <w:proofErr w:type="spellEnd"/>
-      <w:r>
-        <w:t>) ne sont plus de simples cailloux qui brillent dans un torrent, elles sont directement comparées à l'équipement du chevalier ("l'</w:t>
-      </w:r>
-      <w:proofErr w:type="spellStart"/>
-      <w:r>
-        <w:t>òme</w:t>
-      </w:r>
-      <w:proofErr w:type="spellEnd"/>
-      <w:r>
-        <w:t xml:space="preserve"> de </w:t>
-      </w:r>
-      <w:proofErr w:type="spellStart"/>
-      <w:r>
-        <w:t>guèrra</w:t>
-      </w:r>
-      <w:proofErr w:type="spellEnd"/>
-      <w:r>
-        <w:t>") et au regard d'une dame ("coma l'</w:t>
-      </w:r>
-      <w:proofErr w:type="spellStart"/>
-      <w:r>
-        <w:t>uèlh</w:t>
-      </w:r>
-      <w:proofErr w:type="spellEnd"/>
-      <w:r>
-        <w:t xml:space="preserve"> de la </w:t>
-      </w:r>
-      <w:proofErr w:type="spellStart"/>
-      <w:r>
-        <w:t>damaisèla</w:t>
-      </w:r>
-      <w:proofErr w:type="spellEnd"/>
-      <w:r>
-        <w:t>"). La chanson lie désormais intimement la rudesse du décor aux valeurs humaines de ceux qui l'habitent.</w:t>
+        <w:t>"). La chanson lie désormais intimement les traits de la nature aux valeurs humaines de ceux qui l'habitent.</w:t>
       </w:r>
     </w:p>
     <w:p>
@@ -2716,6 +2736,7 @@
           <w:b/>
           <w:bCs/>
         </w:rPr>
+        <w:lastRenderedPageBreak/>
         <w:t>La valeur suprême (</w:t>
       </w:r>
       <w:r>
@@ -2854,76 +2875,72 @@
     </w:p>
     <w:p>
       <w:pPr>
-        <w:rPr>
-          <w:rFonts w:asciiTheme="majorHAnsi" w:eastAsiaTheme="majorEastAsia" w:hAnsiTheme="majorHAnsi" w:cstheme="majorBidi"/>
-          <w:color w:val="0F4761" w:themeColor="accent1" w:themeShade="BF"/>
-          <w:sz w:val="40"/>
-          <w:szCs w:val="40"/>
-          <w:lang w:val="en-US"/>
-        </w:rPr>
-      </w:pPr>
-      <w:r>
-        <w:rPr>
-          <w:lang w:val="en-US"/>
-        </w:rPr>
-        <w:br w:type="page"/>
+        <w:pStyle w:val="Titre1"/>
+        <w:rPr>
+          <w:lang w:val="en-US"/>
+        </w:rPr>
+      </w:pPr>
+      <w:r>
+        <w:rPr>
+          <w:lang w:val="en-US"/>
+        </w:rPr>
+        <w:t>About the Language and Lyrics</w:t>
       </w:r>
     </w:p>
     <w:p>
       <w:pPr>
-        <w:pStyle w:val="Titre1"/>
-        <w:rPr>
-          <w:lang w:val="en-US"/>
-        </w:rPr>
-      </w:pPr>
-      <w:r>
-        <w:rPr>
-          <w:lang w:val="en-US"/>
-        </w:rPr>
-        <w:lastRenderedPageBreak/>
-        <w:t>About the Language and Lyrics</w:t>
+        <w:jc w:val="both"/>
+        <w:rPr>
+          <w:lang w:val="en-US"/>
+        </w:rPr>
+      </w:pPr>
+      <w:r>
+        <w:rPr>
+          <w:lang w:val="en-US"/>
+        </w:rPr>
+        <w:t xml:space="preserve">As a reminder, the language of this song is Occitan, and more specifically its </w:t>
+      </w:r>
+      <w:proofErr w:type="spellStart"/>
+      <w:r>
+        <w:rPr>
+          <w:lang w:val="en-US"/>
+        </w:rPr>
+        <w:t>Languedocien</w:t>
+      </w:r>
+      <w:proofErr w:type="spellEnd"/>
+      <w:r>
+        <w:rPr>
+          <w:lang w:val="en-US"/>
+        </w:rPr>
+        <w:t xml:space="preserve"> standard (the classical and central form of the language)!</w:t>
       </w:r>
     </w:p>
     <w:p>
       <w:pPr>
-        <w:jc w:val="both"/>
-        <w:rPr>
-          <w:lang w:val="en-US"/>
-        </w:rPr>
-      </w:pPr>
-      <w:r>
-        <w:rPr>
-          <w:lang w:val="en-US"/>
-        </w:rPr>
-        <w:t xml:space="preserve">As a reminder, the language of this song is Occitan, and more specifically its </w:t>
-      </w:r>
-      <w:proofErr w:type="spellStart"/>
-      <w:r>
-        <w:rPr>
-          <w:lang w:val="en-US"/>
-        </w:rPr>
-        <w:t>Languedocien</w:t>
-      </w:r>
-      <w:proofErr w:type="spellEnd"/>
-      <w:r>
-        <w:rPr>
-          <w:lang w:val="en-US"/>
-        </w:rPr>
-        <w:t xml:space="preserve"> standard (the classical and central form of the language)!</w:t>
+        <w:pStyle w:val="Titre2"/>
+        <w:rPr>
+          <w:lang w:val="en-US"/>
+        </w:rPr>
+      </w:pPr>
+      <w:r>
+        <w:rPr>
+          <w:lang w:val="en-US"/>
+        </w:rPr>
+        <w:t>Since Version 2: Refining the Language</w:t>
       </w:r>
     </w:p>
     <w:p>
       <w:pPr>
-        <w:pStyle w:val="Titre2"/>
-        <w:rPr>
-          <w:lang w:val="en-US"/>
-        </w:rPr>
-      </w:pPr>
-      <w:r>
-        <w:rPr>
-          <w:lang w:val="en-US"/>
-        </w:rPr>
-        <w:t>Since Version 2: Refining the Language</w:t>
+        <w:jc w:val="both"/>
+        <w:rPr>
+          <w:lang w:val="en-US"/>
+        </w:rPr>
+      </w:pPr>
+      <w:r>
+        <w:rPr>
+          <w:lang w:val="en-US"/>
+        </w:rPr>
+        <w:t>While Occitan immediately gives a local and medieval flavor to a song, it still needs to be accurate. Since the previous version (V2), the text has undergone a complete overhaul to move from "generic fantasy" to a true feudal liturgy. We tracked down poetic weaknesses and linguistic aberrations to offer a pure and striking text.</w:t>
       </w:r>
     </w:p>
     <w:p>
@@ -2937,7 +2954,7 @@
         <w:rPr>
           <w:lang w:val="en-US"/>
         </w:rPr>
-        <w:t>While Occitan immediately gives a local and medieval flavor to a song, it still needs to be accurate. Since the previous version (V2), the text has undergone a complete overhaul to move from "generic fantasy" to a true feudal liturgy. We tracked down poetic weaknesses and linguistic aberrations to offer a pure and striking text.</w:t>
+        <w:t>Here are the main focuses of this rewrite:</w:t>
       </w:r>
     </w:p>
     <w:p>
@@ -2949,9 +2966,29 @@
       </w:pPr>
       <w:r>
         <w:rPr>
-          <w:lang w:val="en-US"/>
-        </w:rPr>
-        <w:t>Here are the main focuses of this rewrite:</w:t>
+          <w:b/>
+          <w:bCs/>
+          <w:lang w:val="en-US"/>
+        </w:rPr>
+        <w:t>1. The End of Invented Rhymes ("Bronze" and "</w:t>
+      </w:r>
+      <w:proofErr w:type="spellStart"/>
+      <w:r>
+        <w:rPr>
+          <w:b/>
+          <w:bCs/>
+          <w:lang w:val="en-US"/>
+        </w:rPr>
+        <w:t>Gronze</w:t>
+      </w:r>
+      <w:proofErr w:type="spellEnd"/>
+      <w:r>
+        <w:rPr>
+          <w:b/>
+          <w:bCs/>
+          <w:lang w:val="en-US"/>
+        </w:rPr>
+        <w:t>")</w:t>
       </w:r>
     </w:p>
     <w:p>
@@ -2963,11 +3000,143 @@
       </w:pPr>
       <w:r>
         <w:rPr>
+          <w:lang w:val="en-US"/>
+        </w:rPr>
+        <w:t xml:space="preserve">In V2, the second verse tried to rhyme </w:t>
+      </w:r>
+      <w:proofErr w:type="spellStart"/>
+      <w:r>
+        <w:rPr>
+          <w:i/>
+          <w:iCs/>
+          <w:lang w:val="en-US"/>
+        </w:rPr>
+        <w:t>flama</w:t>
+      </w:r>
+      <w:proofErr w:type="spellEnd"/>
+      <w:r>
+        <w:rPr>
+          <w:i/>
+          <w:iCs/>
+          <w:lang w:val="en-US"/>
+        </w:rPr>
+        <w:t xml:space="preserve"> de bronze</w:t>
+      </w:r>
+      <w:r>
+        <w:rPr>
+          <w:lang w:val="en-US"/>
+        </w:rPr>
+        <w:t xml:space="preserve"> (flame of bronze) with the wind that </w:t>
+      </w:r>
+      <w:proofErr w:type="spellStart"/>
+      <w:r>
+        <w:rPr>
+          <w:i/>
+          <w:iCs/>
+          <w:lang w:val="en-US"/>
+        </w:rPr>
+        <w:t>gronze</w:t>
+      </w:r>
+      <w:proofErr w:type="spellEnd"/>
+      <w:r>
+        <w:rPr>
+          <w:lang w:val="en-US"/>
+        </w:rPr>
+        <w:t xml:space="preserve">. The problem? Not only is </w:t>
+      </w:r>
+      <w:r>
+        <w:rPr>
+          <w:i/>
+          <w:iCs/>
+          <w:lang w:val="en-US"/>
+        </w:rPr>
+        <w:t>bronze</w:t>
+      </w:r>
+      <w:r>
+        <w:rPr>
+          <w:lang w:val="en-US"/>
+        </w:rPr>
+        <w:t xml:space="preserve"> irrelevant for a mountain forge fire, but the word </w:t>
+      </w:r>
+      <w:proofErr w:type="spellStart"/>
+      <w:r>
+        <w:rPr>
+          <w:i/>
+          <w:iCs/>
+          <w:lang w:val="en-US"/>
+        </w:rPr>
+        <w:t>gronze</w:t>
+      </w:r>
+      <w:proofErr w:type="spellEnd"/>
+      <w:r>
+        <w:rPr>
+          <w:lang w:val="en-US"/>
+        </w:rPr>
+        <w:t xml:space="preserve"> simply does not exist in Occitan! It was a completely invented portmanteau word to force a rhyme with </w:t>
+      </w:r>
+      <w:proofErr w:type="spellStart"/>
+      <w:r>
+        <w:rPr>
+          <w:i/>
+          <w:iCs/>
+          <w:lang w:val="en-US"/>
+        </w:rPr>
+        <w:t>gronhir</w:t>
+      </w:r>
+      <w:proofErr w:type="spellEnd"/>
+      <w:r>
+        <w:rPr>
+          <w:lang w:val="en-US"/>
+        </w:rPr>
+        <w:t xml:space="preserve"> (to growl). We swept this error away by returning to authentic verbs: the valley </w:t>
+      </w:r>
+      <w:proofErr w:type="spellStart"/>
+      <w:r>
+        <w:rPr>
+          <w:i/>
+          <w:iCs/>
+          <w:lang w:val="en-US"/>
+        </w:rPr>
+        <w:t>ressonhís</w:t>
+      </w:r>
+      <w:proofErr w:type="spellEnd"/>
+      <w:r>
+        <w:rPr>
+          <w:lang w:val="en-US"/>
+        </w:rPr>
+        <w:t xml:space="preserve"> (resounds) and the wind </w:t>
+      </w:r>
+      <w:proofErr w:type="spellStart"/>
+      <w:r>
+        <w:rPr>
+          <w:i/>
+          <w:iCs/>
+          <w:lang w:val="en-US"/>
+        </w:rPr>
+        <w:t>gronhís</w:t>
+      </w:r>
+      <w:proofErr w:type="spellEnd"/>
+      <w:r>
+        <w:rPr>
+          <w:lang w:val="en-US"/>
+        </w:rPr>
+        <w:t xml:space="preserve"> (growls), creating an infinitely more natural and fierce assonance.</w:t>
+      </w:r>
+    </w:p>
+    <w:p>
+      <w:pPr>
+        <w:jc w:val="both"/>
+        <w:rPr>
+          <w:lang w:val="en-US"/>
+        </w:rPr>
+      </w:pPr>
+      <w:r>
+        <w:rPr>
           <w:b/>
           <w:bCs/>
           <w:lang w:val="en-US"/>
         </w:rPr>
-        <w:t>1. The End of Invented Rhymes ("Bronze" and "</w:t>
+        <w:t xml:space="preserve">2. Abandoning Absurd Metaphors ("Vira la </w:t>
       </w:r>
       <w:proofErr w:type="spellStart"/>
       <w:r>
@@ -2976,7 +3145,7 @@
           <w:bCs/>
           <w:lang w:val="en-US"/>
         </w:rPr>
-        <w:t>Gronze</w:t>
+        <w:t>vèira</w:t>
       </w:r>
       <w:proofErr w:type="spellEnd"/>
       <w:r>
@@ -2999,7 +3168,7 @@
         <w:rPr>
           <w:lang w:val="en-US"/>
         </w:rPr>
-        <w:t xml:space="preserve">In V2, the second verse tried to rhyme </w:t>
+        <w:t xml:space="preserve">To describe the flight of the eagle, the old version used the expression </w:t>
       </w:r>
       <w:proofErr w:type="spellStart"/>
       <w:r>
@@ -3008,7 +3177,7 @@
           <w:iCs/>
           <w:lang w:val="en-US"/>
         </w:rPr>
-        <w:t>flama</w:t>
+        <w:t>vira</w:t>
       </w:r>
       <w:proofErr w:type="spellEnd"/>
       <w:r>
@@ -3017,13 +3186,7 @@
           <w:iCs/>
           <w:lang w:val="en-US"/>
         </w:rPr>
-        <w:t xml:space="preserve"> de bronze</w:t>
-      </w:r>
-      <w:r>
-        <w:rPr>
-          <w:lang w:val="en-US"/>
-        </w:rPr>
-        <w:t xml:space="preserve"> (flame of bronze) with the wind that </w:t>
+        <w:t xml:space="preserve"> la </w:t>
       </w:r>
       <w:proofErr w:type="spellStart"/>
       <w:r>
@@ -3032,44 +3195,32 @@
           <w:iCs/>
           <w:lang w:val="en-US"/>
         </w:rPr>
-        <w:t>gronze</w:t>
+        <w:t>vèira</w:t>
       </w:r>
       <w:proofErr w:type="spellEnd"/>
       <w:r>
         <w:rPr>
           <w:lang w:val="en-US"/>
         </w:rPr>
-        <w:t xml:space="preserve">. The problem? Not only is </w:t>
-      </w:r>
+        <w:t xml:space="preserve"> (literally: "turns the glass/window"). It was an obscure phrasing, hardly evocative for a song intended to be clear. We replaced it with an image of careful watchfulness and protection: </w:t>
+      </w:r>
+      <w:proofErr w:type="spellStart"/>
       <w:r>
         <w:rPr>
           <w:i/>
           <w:iCs/>
           <w:lang w:val="en-US"/>
         </w:rPr>
-        <w:t>bronze</w:t>
-      </w:r>
-      <w:r>
-        <w:rPr>
-          <w:lang w:val="en-US"/>
-        </w:rPr>
-        <w:t xml:space="preserve"> irrelevant for a mountain forge fire, but the word </w:t>
-      </w:r>
-      <w:proofErr w:type="spellStart"/>
+        <w:t>que</w:t>
+      </w:r>
+      <w:proofErr w:type="spellEnd"/>
       <w:r>
         <w:rPr>
           <w:i/>
           <w:iCs/>
           <w:lang w:val="en-US"/>
         </w:rPr>
-        <w:t>gronze</w:t>
-      </w:r>
-      <w:proofErr w:type="spellEnd"/>
-      <w:r>
-        <w:rPr>
-          <w:lang w:val="en-US"/>
-        </w:rPr>
-        <w:t xml:space="preserve"> simply does not exist in Occitan! It was a completely invented portmanteau word to force a rhyme with </w:t>
+        <w:t xml:space="preserve"> las </w:t>
       </w:r>
       <w:proofErr w:type="spellStart"/>
       <w:r>
@@ -3078,14 +3229,44 @@
           <w:iCs/>
           <w:lang w:val="en-US"/>
         </w:rPr>
-        <w:t>gronhir</w:t>
+        <w:t>abraça</w:t>
       </w:r>
       <w:proofErr w:type="spellEnd"/>
       <w:r>
         <w:rPr>
           <w:lang w:val="en-US"/>
         </w:rPr>
-        <w:t xml:space="preserve"> (to growl). We swept this error away by returning to authentic verbs: the valley </w:t>
+        <w:t xml:space="preserve"> (which embraces them). The eagle no longer merely soars above the mountains; it envelops the valley within its protective wings. This aerial embrace is not a claim of ownership, but a strong and sturdy gesture, comparable to the arms of a father watching over his family.</w:t>
+      </w:r>
+    </w:p>
+    <w:p>
+      <w:pPr>
+        <w:jc w:val="both"/>
+        <w:rPr>
+          <w:lang w:val="en-US"/>
+        </w:rPr>
+      </w:pPr>
+      <w:r>
+        <w:rPr>
+          <w:b/>
+          <w:bCs/>
+          <w:lang w:val="en-US"/>
+        </w:rPr>
+        <w:t>3. Strengthening the Landscape Descriptions</w:t>
+      </w:r>
+    </w:p>
+    <w:p>
+      <w:pPr>
+        <w:jc w:val="both"/>
+        <w:rPr>
+          <w:lang w:val="en-US"/>
+        </w:rPr>
+      </w:pPr>
+      <w:r>
+        <w:rPr>
+          <w:lang w:val="en-US"/>
+        </w:rPr>
+        <w:t xml:space="preserve">The original introduction settled for a somewhat poor and purely descriptive </w:t>
       </w:r>
       <w:proofErr w:type="spellStart"/>
       <w:r>
@@ -3094,30 +3275,92 @@
           <w:iCs/>
           <w:lang w:val="en-US"/>
         </w:rPr>
-        <w:t>ressonhís</w:t>
+        <w:t>montanhas</w:t>
       </w:r>
       <w:proofErr w:type="spellEnd"/>
-      <w:r>
-        <w:rPr>
-          <w:lang w:val="en-US"/>
-        </w:rPr>
-        <w:t xml:space="preserve"> (resounds) and the wind </w:t>
-      </w:r>
-      <w:proofErr w:type="spellStart"/>
       <w:r>
         <w:rPr>
           <w:i/>
           <w:iCs/>
           <w:lang w:val="en-US"/>
         </w:rPr>
-        <w:t>gronhís</w:t>
+        <w:t xml:space="preserve"> de </w:t>
+      </w:r>
+      <w:proofErr w:type="spellStart"/>
+      <w:r>
+        <w:rPr>
+          <w:i/>
+          <w:iCs/>
+          <w:lang w:val="en-US"/>
+        </w:rPr>
+        <w:t>pèira</w:t>
       </w:r>
       <w:proofErr w:type="spellEnd"/>
       <w:r>
         <w:rPr>
           <w:lang w:val="en-US"/>
         </w:rPr>
-        <w:t xml:space="preserve"> (growls), creating an infinitely more natural and fierce assonance.</w:t>
+        <w:t xml:space="preserve"> (mountains of stone). By replacing it with the diptych </w:t>
+      </w:r>
+      <w:r>
+        <w:rPr>
+          <w:i/>
+          <w:iCs/>
+          <w:lang w:val="en-US"/>
+        </w:rPr>
+        <w:t xml:space="preserve">Cimas de </w:t>
+      </w:r>
+      <w:proofErr w:type="spellStart"/>
+      <w:r>
+        <w:rPr>
+          <w:i/>
+          <w:iCs/>
+          <w:lang w:val="en-US"/>
+        </w:rPr>
+        <w:t>nèbla</w:t>
+      </w:r>
+      <w:proofErr w:type="spellEnd"/>
+      <w:r>
+        <w:rPr>
+          <w:i/>
+          <w:iCs/>
+          <w:lang w:val="en-US"/>
+        </w:rPr>
+        <w:t xml:space="preserve">, </w:t>
+      </w:r>
+      <w:proofErr w:type="spellStart"/>
+      <w:r>
+        <w:rPr>
+          <w:i/>
+          <w:iCs/>
+          <w:lang w:val="en-US"/>
+        </w:rPr>
+        <w:t>valh</w:t>
+      </w:r>
+      <w:proofErr w:type="spellEnd"/>
+      <w:r>
+        <w:rPr>
+          <w:i/>
+          <w:iCs/>
+          <w:lang w:val="en-US"/>
+        </w:rPr>
+        <w:t xml:space="preserve"> de </w:t>
+      </w:r>
+      <w:proofErr w:type="spellStart"/>
+      <w:r>
+        <w:rPr>
+          <w:i/>
+          <w:iCs/>
+          <w:lang w:val="en-US"/>
+        </w:rPr>
+        <w:t>glaça</w:t>
+      </w:r>
+      <w:proofErr w:type="spellEnd"/>
+      <w:r>
+        <w:rPr>
+          <w:lang w:val="en-US"/>
+        </w:rPr>
+        <w:t xml:space="preserve"> (Peaks of mist, valley of ice), the landscape nobly arrays itself in its natural elements.</w:t>
       </w:r>
     </w:p>
     <w:p>
@@ -3133,25 +3376,7 @@
           <w:bCs/>
           <w:lang w:val="en-US"/>
         </w:rPr>
-        <w:t xml:space="preserve">2. Abandoning Absurd Metaphors ("Vira la </w:t>
-      </w:r>
-      <w:proofErr w:type="spellStart"/>
-      <w:r>
-        <w:rPr>
-          <w:b/>
-          <w:bCs/>
-          <w:lang w:val="en-US"/>
-        </w:rPr>
-        <w:t>vèira</w:t>
-      </w:r>
-      <w:proofErr w:type="spellEnd"/>
-      <w:r>
-        <w:rPr>
-          <w:b/>
-          <w:bCs/>
-          <w:lang w:val="en-US"/>
-        </w:rPr>
-        <w:t>")</w:t>
+        <w:t>4. From a Descriptive Song to a Grounded Text</w:t>
       </w:r>
     </w:p>
     <w:p>
@@ -3165,25 +3390,31 @@
         <w:rPr>
           <w:lang w:val="en-US"/>
         </w:rPr>
-        <w:t xml:space="preserve">To describe the eagle's flight, the old version used the expression </w:t>
-      </w:r>
-      <w:proofErr w:type="spellStart"/>
+        <w:t>Overall, the work consisted of anchoring the lyrics in the lived experience of its inhabitants. The evoked gems (</w:t>
+      </w:r>
       <w:r>
         <w:rPr>
           <w:i/>
           <w:iCs/>
           <w:lang w:val="en-US"/>
         </w:rPr>
-        <w:t>vira</w:t>
-      </w:r>
-      <w:proofErr w:type="spellEnd"/>
+        <w:t xml:space="preserve">lutz de </w:t>
+      </w:r>
+      <w:proofErr w:type="spellStart"/>
       <w:r>
         <w:rPr>
           <w:i/>
           <w:iCs/>
           <w:lang w:val="en-US"/>
         </w:rPr>
-        <w:t xml:space="preserve"> la </w:t>
+        <w:t>saphir</w:t>
+      </w:r>
+      <w:proofErr w:type="spellEnd"/>
+      <w:r>
+        <w:rPr>
+          <w:lang w:val="en-US"/>
+        </w:rPr>
+        <w:t xml:space="preserve">, </w:t>
       </w:r>
       <w:proofErr w:type="spellStart"/>
       <w:r>
@@ -3192,340 +3423,92 @@
           <w:iCs/>
           <w:lang w:val="en-US"/>
         </w:rPr>
-        <w:t>vèira</w:t>
+        <w:t>topazi</w:t>
       </w:r>
       <w:proofErr w:type="spellEnd"/>
-      <w:r>
-        <w:rPr>
-          <w:lang w:val="en-US"/>
-        </w:rPr>
-        <w:t xml:space="preserve"> (literally: "turns the glass/window"). This phrasing was far too bizarre and obscure for a martial song that needs to be direct. We replaced it with a clear image of territorial domination: </w:t>
-      </w:r>
-      <w:proofErr w:type="spellStart"/>
       <w:r>
         <w:rPr>
           <w:i/>
           <w:iCs/>
           <w:lang w:val="en-US"/>
         </w:rPr>
-        <w:t>que</w:t>
-      </w:r>
-      <w:proofErr w:type="spellEnd"/>
+        <w:t xml:space="preserve"> </w:t>
+      </w:r>
+      <w:proofErr w:type="spellStart"/>
       <w:r>
         <w:rPr>
           <w:i/>
           <w:iCs/>
           <w:lang w:val="en-US"/>
         </w:rPr>
-        <w:t xml:space="preserve"> las </w:t>
+        <w:t>clar</w:t>
+      </w:r>
+      <w:proofErr w:type="spellEnd"/>
+      <w:r>
+        <w:rPr>
+          <w:lang w:val="en-US"/>
+        </w:rPr>
+        <w:t>) are no longer simple pebbles shining in a torrent; they are directly compared to the knight's equipment ("</w:t>
       </w:r>
       <w:proofErr w:type="spellStart"/>
       <w:r>
         <w:rPr>
-          <w:i/>
-          <w:iCs/>
-          <w:lang w:val="en-US"/>
-        </w:rPr>
-        <w:t>abraça</w:t>
+          <w:lang w:val="en-US"/>
+        </w:rPr>
+        <w:t>l'òme</w:t>
       </w:r>
       <w:proofErr w:type="spellEnd"/>
       <w:r>
         <w:rPr>
           <w:lang w:val="en-US"/>
         </w:rPr>
-        <w:t xml:space="preserve"> (which embraces them). The eagle no longer merely flies; it envelops and possesses its feudal domain with the tips of its wings.</w:t>
+        <w:t xml:space="preserve"> de </w:t>
+      </w:r>
+      <w:proofErr w:type="spellStart"/>
+      <w:r>
+        <w:rPr>
+          <w:lang w:val="en-US"/>
+        </w:rPr>
+        <w:t>guèrra</w:t>
+      </w:r>
+      <w:proofErr w:type="spellEnd"/>
+      <w:r>
+        <w:rPr>
+          <w:lang w:val="en-US"/>
+        </w:rPr>
+        <w:t xml:space="preserve">") and to a lady's gaze ("coma </w:t>
+      </w:r>
+      <w:proofErr w:type="spellStart"/>
+      <w:r>
+        <w:rPr>
+          <w:lang w:val="en-US"/>
+        </w:rPr>
+        <w:t>l'uèlh</w:t>
+      </w:r>
+      <w:proofErr w:type="spellEnd"/>
+      <w:r>
+        <w:rPr>
+          <w:lang w:val="en-US"/>
+        </w:rPr>
+        <w:t xml:space="preserve"> de la </w:t>
+      </w:r>
+      <w:proofErr w:type="spellStart"/>
+      <w:r>
+        <w:rPr>
+          <w:lang w:val="en-US"/>
+        </w:rPr>
+        <w:t>damaisèla</w:t>
+      </w:r>
+      <w:proofErr w:type="spellEnd"/>
+      <w:r>
+        <w:rPr>
+          <w:lang w:val="en-US"/>
+        </w:rPr>
+        <w:t>"). The song now intimately links the features of nature to the human values of those who inhabit it.</w:t>
       </w:r>
     </w:p>
     <w:p>
       <w:pPr>
-        <w:jc w:val="both"/>
-        <w:rPr>
-          <w:lang w:val="en-US"/>
-        </w:rPr>
-      </w:pPr>
-      <w:r>
-        <w:rPr>
-          <w:b/>
-          <w:bCs/>
-          <w:lang w:val="en-US"/>
-        </w:rPr>
-        <w:t>3. Strengthening the Landscape Descriptions</w:t>
-      </w:r>
-    </w:p>
-    <w:p>
-      <w:pPr>
-        <w:jc w:val="both"/>
-        <w:rPr>
-          <w:lang w:val="en-US"/>
-        </w:rPr>
-      </w:pPr>
-      <w:r>
-        <w:rPr>
-          <w:lang w:val="en-US"/>
-        </w:rPr>
-        <w:t xml:space="preserve">The original introduction settled for a somewhat poor and overly simple </w:t>
-      </w:r>
-      <w:proofErr w:type="spellStart"/>
-      <w:r>
-        <w:rPr>
-          <w:i/>
-          <w:iCs/>
-          <w:lang w:val="en-US"/>
-        </w:rPr>
-        <w:t>montanhas</w:t>
-      </w:r>
-      <w:proofErr w:type="spellEnd"/>
-      <w:r>
-        <w:rPr>
-          <w:i/>
-          <w:iCs/>
-          <w:lang w:val="en-US"/>
-        </w:rPr>
-        <w:t xml:space="preserve"> de </w:t>
-      </w:r>
-      <w:proofErr w:type="spellStart"/>
-      <w:r>
-        <w:rPr>
-          <w:i/>
-          <w:iCs/>
-          <w:lang w:val="en-US"/>
-        </w:rPr>
-        <w:t>pèira</w:t>
-      </w:r>
-      <w:proofErr w:type="spellEnd"/>
-      <w:r>
-        <w:rPr>
-          <w:lang w:val="en-US"/>
-        </w:rPr>
-        <w:t xml:space="preserve"> (mountains of stone). By replacing it with the diptych </w:t>
-      </w:r>
-      <w:r>
-        <w:rPr>
-          <w:i/>
-          <w:iCs/>
-          <w:lang w:val="en-US"/>
-        </w:rPr>
-        <w:t xml:space="preserve">Cimas de </w:t>
-      </w:r>
-      <w:proofErr w:type="spellStart"/>
-      <w:r>
-        <w:rPr>
-          <w:i/>
-          <w:iCs/>
-          <w:lang w:val="en-US"/>
-        </w:rPr>
-        <w:t>nèbla</w:t>
-      </w:r>
-      <w:proofErr w:type="spellEnd"/>
-      <w:r>
-        <w:rPr>
-          <w:i/>
-          <w:iCs/>
-          <w:lang w:val="en-US"/>
-        </w:rPr>
-        <w:t xml:space="preserve">, </w:t>
-      </w:r>
-      <w:proofErr w:type="spellStart"/>
-      <w:r>
-        <w:rPr>
-          <w:i/>
-          <w:iCs/>
-          <w:lang w:val="en-US"/>
-        </w:rPr>
-        <w:t>valh</w:t>
-      </w:r>
-      <w:proofErr w:type="spellEnd"/>
-      <w:r>
-        <w:rPr>
-          <w:i/>
-          <w:iCs/>
-          <w:lang w:val="en-US"/>
-        </w:rPr>
-        <w:t xml:space="preserve"> de </w:t>
-      </w:r>
-      <w:proofErr w:type="spellStart"/>
-      <w:r>
-        <w:rPr>
-          <w:i/>
-          <w:iCs/>
-          <w:lang w:val="en-US"/>
-        </w:rPr>
-        <w:t>glaça</w:t>
-      </w:r>
-      <w:proofErr w:type="spellEnd"/>
-      <w:r>
-        <w:rPr>
-          <w:lang w:val="en-US"/>
-        </w:rPr>
-        <w:t xml:space="preserve"> (Peaks of mist, valley of ice), the text immediately establishes a harsh, inhospitable, and mystical atmosphere worthy of a baron's fortress. The landscape comes alive.</w:t>
-      </w:r>
-    </w:p>
-    <w:p>
-      <w:pPr>
-        <w:jc w:val="both"/>
-        <w:rPr>
-          <w:lang w:val="en-US"/>
-        </w:rPr>
-      </w:pPr>
-      <w:r>
-        <w:rPr>
-          <w:b/>
-          <w:bCs/>
-          <w:lang w:val="en-US"/>
-        </w:rPr>
-        <w:t>4. From a Descriptive Song to a Grounded Text</w:t>
-      </w:r>
-    </w:p>
-    <w:p>
-      <w:pPr>
-        <w:jc w:val="both"/>
-        <w:rPr>
-          <w:lang w:val="en-US"/>
-        </w:rPr>
-      </w:pPr>
-      <w:r>
-        <w:rPr>
-          <w:lang w:val="en-US"/>
-        </w:rPr>
-        <w:t>Overall, the work consisted of deeply grounding the lyrics into the lore. The evoked gems (</w:t>
-      </w:r>
-      <w:r>
-        <w:rPr>
-          <w:i/>
-          <w:iCs/>
-          <w:lang w:val="en-US"/>
-        </w:rPr>
-        <w:t xml:space="preserve">lutz de </w:t>
-      </w:r>
-      <w:proofErr w:type="spellStart"/>
-      <w:r>
-        <w:rPr>
-          <w:i/>
-          <w:iCs/>
-          <w:lang w:val="en-US"/>
-        </w:rPr>
-        <w:t>saphir</w:t>
-      </w:r>
-      <w:proofErr w:type="spellEnd"/>
-      <w:r>
-        <w:rPr>
-          <w:lang w:val="en-US"/>
-        </w:rPr>
-        <w:t xml:space="preserve">, </w:t>
-      </w:r>
-      <w:proofErr w:type="spellStart"/>
-      <w:r>
-        <w:rPr>
-          <w:i/>
-          <w:iCs/>
-          <w:lang w:val="en-US"/>
-        </w:rPr>
-        <w:t>topazi</w:t>
-      </w:r>
-      <w:proofErr w:type="spellEnd"/>
-      <w:r>
-        <w:rPr>
-          <w:i/>
-          <w:iCs/>
-          <w:lang w:val="en-US"/>
-        </w:rPr>
-        <w:t xml:space="preserve"> </w:t>
-      </w:r>
-      <w:proofErr w:type="spellStart"/>
-      <w:r>
-        <w:rPr>
-          <w:i/>
-          <w:iCs/>
-          <w:lang w:val="en-US"/>
-        </w:rPr>
-        <w:t>clar</w:t>
-      </w:r>
-      <w:proofErr w:type="spellEnd"/>
-      <w:r>
-        <w:rPr>
-          <w:lang w:val="en-US"/>
-        </w:rPr>
-        <w:t>) are no longer simple pebbles shining in a torrent; they are directly compared to the knight's equipment (</w:t>
-      </w:r>
-      <w:proofErr w:type="spellStart"/>
-      <w:r>
-        <w:rPr>
-          <w:i/>
-          <w:iCs/>
-          <w:lang w:val="en-US"/>
-        </w:rPr>
-        <w:t>l'òme</w:t>
-      </w:r>
-      <w:proofErr w:type="spellEnd"/>
-      <w:r>
-        <w:rPr>
-          <w:i/>
-          <w:iCs/>
-          <w:lang w:val="en-US"/>
-        </w:rPr>
-        <w:t xml:space="preserve"> de </w:t>
-      </w:r>
-      <w:proofErr w:type="spellStart"/>
-      <w:r>
-        <w:rPr>
-          <w:i/>
-          <w:iCs/>
-          <w:lang w:val="en-US"/>
-        </w:rPr>
-        <w:t>guèrra</w:t>
-      </w:r>
-      <w:proofErr w:type="spellEnd"/>
-      <w:r>
-        <w:rPr>
-          <w:lang w:val="en-US"/>
-        </w:rPr>
-        <w:t xml:space="preserve"> / the man of war) and to a lady's gaze (</w:t>
-      </w:r>
-      <w:r>
-        <w:rPr>
-          <w:i/>
-          <w:iCs/>
-          <w:lang w:val="en-US"/>
-        </w:rPr>
-        <w:t xml:space="preserve">coma </w:t>
-      </w:r>
-      <w:proofErr w:type="spellStart"/>
-      <w:r>
-        <w:rPr>
-          <w:i/>
-          <w:iCs/>
-          <w:lang w:val="en-US"/>
-        </w:rPr>
-        <w:t>l'uèlh</w:t>
-      </w:r>
-      <w:proofErr w:type="spellEnd"/>
-      <w:r>
-        <w:rPr>
-          <w:i/>
-          <w:iCs/>
-          <w:lang w:val="en-US"/>
-        </w:rPr>
-        <w:t xml:space="preserve"> de la </w:t>
-      </w:r>
-      <w:proofErr w:type="spellStart"/>
-      <w:r>
-        <w:rPr>
-          <w:i/>
-          <w:iCs/>
-          <w:lang w:val="en-US"/>
-        </w:rPr>
-        <w:t>damaisèla</w:t>
-      </w:r>
-      <w:proofErr w:type="spellEnd"/>
-      <w:r>
-        <w:rPr>
-          <w:lang w:val="en-US"/>
-        </w:rPr>
-        <w:t>). The song now intimately links the harshness of the setting to the human values of those who inhabit it.</w:t>
-      </w:r>
-    </w:p>
-    <w:p>
-      <w:pPr>
         <w:pStyle w:val="Titre2"/>
         <w:rPr>
           <w:lang w:val="en-US"/>
@@ -3535,6 +3518,7 @@
         <w:rPr>
           <w:lang w:val="en-US"/>
         </w:rPr>
+        <w:lastRenderedPageBreak/>
         <w:t>Decoding the Lexicon</w:t>
       </w:r>
     </w:p>
@@ -3857,7 +3841,6 @@
           <w:bCs/>
           <w:lang w:val="en-US"/>
         </w:rPr>
-        <w:lastRenderedPageBreak/>
         <w:t>A Bestial Nature (</w:t>
       </w:r>
       <w:proofErr w:type="spellStart"/>
@@ -9974,7 +9957,6 @@
   <w:style w:type="character" w:default="1" w:styleId="Policepardfaut">
     <w:name w:val="Default Paragraph Font"/>
     <w:uiPriority w:val="1"/>
-    <w:semiHidden/>
     <w:unhideWhenUsed/>
   </w:style>
   <w:style w:type="table" w:default="1" w:styleId="TableauNormal">

</xml_diff>

<commit_message>
Petite correction de mise en page du booklet v3 sur le Blason de l'Aigle
</commit_message>
<xml_diff>
--- a/assets/Terre-de-Barons-TB7-Eagle-Crest-Lyrics-v3.docx
+++ b/assets/Terre-de-Barons-TB7-Eagle-Crest-Lyrics-v3.docx
@@ -89,15 +89,7 @@
         <w:t>Note sur la langue du chant</w:t>
       </w:r>
       <w:r>
-        <w:t xml:space="preserve"> – Les paroles de cet hymne sont interprétées dans un occitan médiéval unifié. L'interprétation musicale de ce chant n'est pas le fruit d'une génération automatique directe par une intelligence artificielle. Elle résulte d'un long processus de </w:t>
-      </w:r>
-      <w:proofErr w:type="spellStart"/>
-      <w:r>
-        <w:t>co-création</w:t>
-      </w:r>
-      <w:proofErr w:type="spellEnd"/>
-      <w:r>
-        <w:t xml:space="preserve"> assistée. Ce travail itératif et persévérant a d'abord visé à aligner les rendus linguistique et poétique sur la thématique seigneuriale, avant de modeler le rendu sonore pour obtenir entière satisfaction. Les détails concernant les particularités de ce lexique sont expliqués à la fin de ce document, après les paroles et leurs traductions.</w:t>
+        <w:t xml:space="preserve"> – Les paroles de cet hymne sont interprétées dans un occitan médiéval unifié. L'interprétation musicale de ce chant n'est pas le fruit d'une génération automatique directe par une intelligence artificielle. Elle résulte d'un long processus de co-création assistée. Ce travail itératif et persévérant a d'abord visé à aligner les rendus linguistique et poétique sur la thématique seigneuriale, avant de modeler le rendu sonore pour obtenir entière satisfaction. Les détails concernant les particularités de ce lexique sont expliqués à la fin de ce document, après les paroles et leurs traductions.</w:t>
       </w:r>
     </w:p>
     <w:p>
@@ -745,6 +737,9 @@
         <w:tc>
           <w:tcPr>
             <w:tcW w:w="1666" w:type="pct"/>
+            <w:tcBorders>
+              <w:bottom w:val="single" w:sz="4" w:space="0" w:color="auto"/>
+            </w:tcBorders>
             <w:vAlign w:val="center"/>
           </w:tcPr>
           <w:p>
@@ -768,6 +763,9 @@
         <w:tc>
           <w:tcPr>
             <w:tcW w:w="1667" w:type="pct"/>
+            <w:tcBorders>
+              <w:bottom w:val="single" w:sz="4" w:space="0" w:color="auto"/>
+            </w:tcBorders>
             <w:vAlign w:val="center"/>
           </w:tcPr>
           <w:p>
@@ -779,6 +777,9 @@
         <w:tc>
           <w:tcPr>
             <w:tcW w:w="1667" w:type="pct"/>
+            <w:tcBorders>
+              <w:bottom w:val="single" w:sz="4" w:space="0" w:color="auto"/>
+            </w:tcBorders>
             <w:vAlign w:val="center"/>
           </w:tcPr>
           <w:p>
@@ -791,21 +792,7 @@
               <w:rPr>
                 <w:lang w:val="en-US"/>
               </w:rPr>
-              <w:t xml:space="preserve">Gold and azure </w:t>
-            </w:r>
-            <w:proofErr w:type="gramStart"/>
-            <w:r>
-              <w:rPr>
-                <w:lang w:val="en-US"/>
-              </w:rPr>
-              <w:t>( gold</w:t>
-            </w:r>
-            <w:proofErr w:type="gramEnd"/>
-            <w:r>
-              <w:rPr>
-                <w:lang w:val="en-US"/>
-              </w:rPr>
-              <w:t xml:space="preserve"> and azure) reflect in the sky!</w:t>
+              <w:t>Gold and azure (gold and azure) reflect in the sky!</w:t>
             </w:r>
           </w:p>
         </w:tc>
@@ -814,6 +801,9 @@
         <w:tc>
           <w:tcPr>
             <w:tcW w:w="1666" w:type="pct"/>
+            <w:tcBorders>
+              <w:bottom w:val="single" w:sz="4" w:space="0" w:color="auto"/>
+            </w:tcBorders>
             <w:vAlign w:val="center"/>
           </w:tcPr>
           <w:p>
@@ -837,6 +827,9 @@
         <w:tc>
           <w:tcPr>
             <w:tcW w:w="1667" w:type="pct"/>
+            <w:tcBorders>
+              <w:bottom w:val="single" w:sz="4" w:space="0" w:color="auto"/>
+            </w:tcBorders>
             <w:vAlign w:val="center"/>
           </w:tcPr>
           <w:p>
@@ -847,23 +840,14 @@
               <w:t xml:space="preserve"> *</w:t>
             </w:r>
           </w:p>
-          <w:p>
-            <w:r>
-              <w:t>(Note : "</w:t>
-            </w:r>
-            <w:proofErr w:type="spellStart"/>
-            <w:r>
-              <w:t>prètz</w:t>
-            </w:r>
-            <w:proofErr w:type="spellEnd"/>
-            <w:r>
-              <w:t>" en occitan médiéval désigne à la fois le prix, le mérite et la valeur chevaleresque).</w:t>
-            </w:r>
-          </w:p>
+          <w:p/>
         </w:tc>
         <w:tc>
           <w:tcPr>
             <w:tcW w:w="1667" w:type="pct"/>
+            <w:tcBorders>
+              <w:bottom w:val="single" w:sz="4" w:space="0" w:color="auto"/>
+            </w:tcBorders>
             <w:vAlign w:val="center"/>
           </w:tcPr>
           <w:p>
@@ -877,6 +861,31 @@
                 <w:lang w:val="en-US"/>
               </w:rPr>
               <w:t>We guard the realm, honor is preserved!</w:t>
+            </w:r>
+          </w:p>
+        </w:tc>
+      </w:tr>
+      <w:tr>
+        <w:tc>
+          <w:tcPr>
+            <w:tcW w:w="5000" w:type="pct"/>
+            <w:gridSpan w:val="3"/>
+            <w:tcBorders>
+              <w:top w:val="single" w:sz="4" w:space="0" w:color="auto"/>
+              <w:left w:val="nil"/>
+              <w:bottom w:val="nil"/>
+              <w:right w:val="nil"/>
+            </w:tcBorders>
+            <w:vAlign w:val="center"/>
+          </w:tcPr>
+          <w:p>
+            <w:pPr>
+              <w:rPr>
+                <w:lang w:val="en-US"/>
+              </w:rPr>
+            </w:pPr>
+            <w:r>
+              <w:t>(*Note : "prètz" en occitan médiéval désigne à la fois le prix, le mérite et la valeur chevaleresque).</w:t>
             </w:r>
           </w:p>
         </w:tc>
@@ -2158,23 +2167,125 @@
           <w:b/>
           <w:bCs/>
         </w:rPr>
-        <w:t>1. La fin des rimes inventées ("Bronze" et "</w:t>
-      </w:r>
-      <w:proofErr w:type="spellStart"/>
+        <w:t>1. La fin des rimes inventées ("Bronze" et "Gronze")</w:t>
+      </w:r>
+    </w:p>
+    <w:p>
+      <w:pPr>
+        <w:jc w:val="both"/>
+      </w:pPr>
+      <w:r>
+        <w:t xml:space="preserve">Dans la V2, le second couplet tentait de faire rimer "flama de bronze" avec le vent qui "gronze". Le problème ? Si </w:t>
+      </w:r>
+      <w:r>
+        <w:rPr>
+          <w:i/>
+          <w:iCs/>
+        </w:rPr>
+        <w:t>bronze</w:t>
+      </w:r>
+      <w:r>
+        <w:t xml:space="preserve"> est hors de propos pour un feu montagnard, le mot </w:t>
+      </w:r>
+      <w:r>
+        <w:rPr>
+          <w:i/>
+          <w:iCs/>
+        </w:rPr>
+        <w:t>gronze</w:t>
+      </w:r>
+      <w:r>
+        <w:t xml:space="preserve"> n'existe tout simplement pas en occitan ! C'était un mot-valise inventé de toutes pièces pour forcer la rime avec </w:t>
+      </w:r>
+      <w:r>
+        <w:rPr>
+          <w:i/>
+          <w:iCs/>
+        </w:rPr>
+        <w:t>gronhir</w:t>
+      </w:r>
+      <w:r>
+        <w:t xml:space="preserve"> (grogner). Nous avons balayé cette erreur en revenant à des verbes authentiques : la vallée </w:t>
+      </w:r>
+      <w:r>
+        <w:rPr>
+          <w:i/>
+          <w:iCs/>
+        </w:rPr>
+        <w:t>ressonhís</w:t>
+      </w:r>
+      <w:r>
+        <w:t xml:space="preserve"> (résonne) et le vent </w:t>
+      </w:r>
+      <w:r>
+        <w:rPr>
+          <w:i/>
+          <w:iCs/>
+        </w:rPr>
+        <w:t>gronhís</w:t>
+      </w:r>
+      <w:r>
+        <w:t xml:space="preserve"> (grogne), créant une assonance infiniment plus naturelle et féroce.</w:t>
+      </w:r>
+    </w:p>
+    <w:p>
+      <w:pPr>
+        <w:jc w:val="both"/>
+      </w:pPr>
       <w:r>
         <w:rPr>
           <w:b/>
           <w:bCs/>
         </w:rPr>
-        <w:t>Gronze</w:t>
-      </w:r>
-      <w:proofErr w:type="spellEnd"/>
+        <w:t>2. L'abandon des métaphores absurdes ("Vira la vèira")</w:t>
+      </w:r>
+    </w:p>
+    <w:p>
+      <w:pPr>
+        <w:jc w:val="both"/>
+      </w:pPr>
+      <w:r>
+        <w:t xml:space="preserve">Pour décrire le vol de l'aigle, l'ancienne version utilisait l'expression </w:t>
+      </w:r>
+      <w:r>
+        <w:rPr>
+          <w:i/>
+          <w:iCs/>
+        </w:rPr>
+        <w:t>vira la vèira</w:t>
+      </w:r>
+      <w:r>
+        <w:t xml:space="preserve"> (littéralement : </w:t>
+      </w:r>
+      <w:proofErr w:type="gramStart"/>
+      <w:r>
+        <w:t>"tourne la</w:t>
+      </w:r>
+      <w:proofErr w:type="gramEnd"/>
+      <w:r>
+        <w:t xml:space="preserve"> vitre/le verre"). Une tournure obscure et peu évocatrice pour un chant qui se veut clair. Nous l'avons remplacée par une image de surveillance attentive et de protection : </w:t>
+      </w:r>
+      <w:r>
+        <w:rPr>
+          <w:i/>
+          <w:iCs/>
+        </w:rPr>
+        <w:t>que las abraça</w:t>
+      </w:r>
+      <w:r>
+        <w:t xml:space="preserve"> (qui les embrasse). L'aigle ne se contente plus de survoler les montagnes ; il enveloppe la vallée de ses ailes protectrices. Cette étreinte aérienne n'est pas une prise de possession, mais un geste fort et solide, comparable aux bras d'un père veillant sur sa famille</w:t>
+      </w:r>
+    </w:p>
+    <w:p>
+      <w:pPr>
+        <w:jc w:val="both"/>
+      </w:pPr>
       <w:r>
         <w:rPr>
           <w:b/>
           <w:bCs/>
         </w:rPr>
-        <w:t>")</w:t>
+        <w:t>3. Le renforcement des descriptions paysagères</w:t>
       </w:r>
     </w:p>
     <w:p>
@@ -2182,344 +2293,67 @@
         <w:jc w:val="both"/>
       </w:pPr>
       <w:r>
-        <w:t>Dans la V2, le second couplet tentait de faire rimer "flama de bronze" avec le vent qui "</w:t>
-      </w:r>
-      <w:proofErr w:type="spellStart"/>
-      <w:r>
-        <w:t>gronze</w:t>
-      </w:r>
-      <w:proofErr w:type="spellEnd"/>
-      <w:r>
-        <w:t xml:space="preserve">". Le problème ? Si </w:t>
+        <w:t xml:space="preserve">L'introduction originale se contentait d'un </w:t>
       </w:r>
       <w:r>
         <w:rPr>
           <w:i/>
           <w:iCs/>
         </w:rPr>
-        <w:t>bronze</w:t>
-      </w:r>
-      <w:r>
-        <w:t xml:space="preserve"> est hors de propos pour un feu montagnard, le mot </w:t>
-      </w:r>
-      <w:proofErr w:type="spellStart"/>
+        <w:t>montanhas de pèira</w:t>
+      </w:r>
+      <w:r>
+        <w:t xml:space="preserve"> (montagnes de pierre) un peu pauvre et purement descriptif. En le remplaçant par le diptyque </w:t>
+      </w:r>
       <w:r>
         <w:rPr>
           <w:i/>
           <w:iCs/>
         </w:rPr>
-        <w:t>gronze</w:t>
-      </w:r>
-      <w:proofErr w:type="spellEnd"/>
-      <w:r>
-        <w:t xml:space="preserve"> n'existe tout simplement pas en occitan ! C'était un mot-valise inventé de toutes pièces pour forcer la rime avec </w:t>
-      </w:r>
-      <w:proofErr w:type="spellStart"/>
+        <w:t>Cimas de nèbla, valh de glaça</w:t>
+      </w:r>
+      <w:r>
+        <w:t xml:space="preserve"> (Cimes de brume, vallée de glace), le paysage s'habille et se pare noblement de ses éléments naturels.</w:t>
+      </w:r>
+    </w:p>
+    <w:p>
+      <w:pPr>
+        <w:jc w:val="both"/>
+      </w:pPr>
+      <w:r>
+        <w:rPr>
+          <w:b/>
+          <w:bCs/>
+        </w:rPr>
+        <w:t>4. D'un chant descriptif à un texte ancré dans le réel</w:t>
+      </w:r>
+    </w:p>
+    <w:p>
+      <w:pPr>
+        <w:jc w:val="both"/>
+      </w:pPr>
+      <w:r>
+        <w:t>Globalement, le travail a consisté à ancrer les paroles dans le vécu de ses habitants. Les gemmes évoquées (</w:t>
+      </w:r>
       <w:r>
         <w:rPr>
           <w:i/>
           <w:iCs/>
         </w:rPr>
-        <w:t>gronhir</w:t>
-      </w:r>
-      <w:proofErr w:type="spellEnd"/>
-      <w:r>
-        <w:t xml:space="preserve"> (grogner). Nous avons balayé cette erreur en revenant à des verbes authentiques : la vallée </w:t>
-      </w:r>
-      <w:proofErr w:type="spellStart"/>
+        <w:t>lutz de saphir</w:t>
+      </w:r>
+      <w:r>
+        <w:t xml:space="preserve">, </w:t>
+      </w:r>
       <w:r>
         <w:rPr>
           <w:i/>
           <w:iCs/>
         </w:rPr>
-        <w:t>ressonhís</w:t>
-      </w:r>
-      <w:proofErr w:type="spellEnd"/>
-      <w:r>
-        <w:t xml:space="preserve"> (résonne) et le vent </w:t>
-      </w:r>
-      <w:proofErr w:type="spellStart"/>
-      <w:r>
-        <w:rPr>
-          <w:i/>
-          <w:iCs/>
-        </w:rPr>
-        <w:t>gronhís</w:t>
-      </w:r>
-      <w:proofErr w:type="spellEnd"/>
-      <w:r>
-        <w:t xml:space="preserve"> (grogne), créant une assonance infiniment plus naturelle et féroce.</w:t>
-      </w:r>
-    </w:p>
-    <w:p>
-      <w:pPr>
-        <w:jc w:val="both"/>
-      </w:pPr>
-      <w:r>
-        <w:rPr>
-          <w:b/>
-          <w:bCs/>
-        </w:rPr>
-        <w:t xml:space="preserve">2. L'abandon des métaphores absurdes ("Vira la </w:t>
-      </w:r>
-      <w:proofErr w:type="spellStart"/>
-      <w:r>
-        <w:rPr>
-          <w:b/>
-          <w:bCs/>
-        </w:rPr>
-        <w:t>vèira</w:t>
-      </w:r>
-      <w:proofErr w:type="spellEnd"/>
-      <w:r>
-        <w:rPr>
-          <w:b/>
-          <w:bCs/>
-        </w:rPr>
-        <w:t>")</w:t>
-      </w:r>
-    </w:p>
-    <w:p>
-      <w:pPr>
-        <w:jc w:val="both"/>
-      </w:pPr>
-      <w:r>
-        <w:t xml:space="preserve">Pour décrire le vol de l'aigle, l'ancienne version utilisait l'expression </w:t>
-      </w:r>
-      <w:r>
-        <w:rPr>
-          <w:i/>
-          <w:iCs/>
-        </w:rPr>
-        <w:t xml:space="preserve">vira la </w:t>
-      </w:r>
-      <w:proofErr w:type="spellStart"/>
-      <w:r>
-        <w:rPr>
-          <w:i/>
-          <w:iCs/>
-        </w:rPr>
-        <w:t>vèira</w:t>
-      </w:r>
-      <w:proofErr w:type="spellEnd"/>
-      <w:r>
-        <w:t xml:space="preserve"> (littéralement : </w:t>
-      </w:r>
-      <w:proofErr w:type="gramStart"/>
-      <w:r>
-        <w:t>"tourne la</w:t>
-      </w:r>
-      <w:proofErr w:type="gramEnd"/>
-      <w:r>
-        <w:t xml:space="preserve"> vitre/le verre"). Une tournure obscure et peu évocatrice pour un chant qui se veut clair. Nous l'avons remplacée par une image de surveillance attentive et de protection : </w:t>
-      </w:r>
-      <w:r>
-        <w:rPr>
-          <w:i/>
-          <w:iCs/>
-        </w:rPr>
-        <w:t xml:space="preserve">que las </w:t>
-      </w:r>
-      <w:proofErr w:type="spellStart"/>
-      <w:r>
-        <w:rPr>
-          <w:i/>
-          <w:iCs/>
-        </w:rPr>
-        <w:t>abraça</w:t>
-      </w:r>
-      <w:proofErr w:type="spellEnd"/>
-      <w:r>
-        <w:t xml:space="preserve"> (qui les embrasse). L'aigle ne se contente plus de survoler les montagnes ; il enveloppe la vallée de ses ailes protectrices. Cette étreinte aérienne n'est pas une prise de possession, mais un geste fort et solide, comparable aux bras d'un père veillant sur sa famille</w:t>
-      </w:r>
-    </w:p>
-    <w:p>
-      <w:pPr>
-        <w:jc w:val="both"/>
-      </w:pPr>
-      <w:r>
-        <w:rPr>
-          <w:b/>
-          <w:bCs/>
-        </w:rPr>
-        <w:t>3. Le renforcement des descriptions paysagères</w:t>
-      </w:r>
-    </w:p>
-    <w:p>
-      <w:pPr>
-        <w:jc w:val="both"/>
-      </w:pPr>
-      <w:r>
-        <w:t xml:space="preserve">L'introduction originale se contentait d'un </w:t>
-      </w:r>
-      <w:proofErr w:type="spellStart"/>
-      <w:r>
-        <w:rPr>
-          <w:i/>
-          <w:iCs/>
-        </w:rPr>
-        <w:t>montanhas</w:t>
-      </w:r>
-      <w:proofErr w:type="spellEnd"/>
-      <w:r>
-        <w:rPr>
-          <w:i/>
-          <w:iCs/>
-        </w:rPr>
-        <w:t xml:space="preserve"> de </w:t>
-      </w:r>
-      <w:proofErr w:type="spellStart"/>
-      <w:r>
-        <w:rPr>
-          <w:i/>
-          <w:iCs/>
-        </w:rPr>
-        <w:t>pèira</w:t>
-      </w:r>
-      <w:proofErr w:type="spellEnd"/>
-      <w:r>
-        <w:t xml:space="preserve"> (montagnes de pierre) un peu pauvre et purement descriptif. En le remplaçant par le diptyque </w:t>
-      </w:r>
-      <w:r>
-        <w:rPr>
-          <w:i/>
-          <w:iCs/>
-        </w:rPr>
-        <w:t xml:space="preserve">Cimas de </w:t>
-      </w:r>
-      <w:proofErr w:type="spellStart"/>
-      <w:r>
-        <w:rPr>
-          <w:i/>
-          <w:iCs/>
-        </w:rPr>
-        <w:t>nèbla</w:t>
-      </w:r>
-      <w:proofErr w:type="spellEnd"/>
-      <w:r>
-        <w:rPr>
-          <w:i/>
-          <w:iCs/>
-        </w:rPr>
-        <w:t xml:space="preserve">, </w:t>
-      </w:r>
-      <w:proofErr w:type="spellStart"/>
-      <w:r>
-        <w:rPr>
-          <w:i/>
-          <w:iCs/>
-        </w:rPr>
-        <w:t>valh</w:t>
-      </w:r>
-      <w:proofErr w:type="spellEnd"/>
-      <w:r>
-        <w:rPr>
-          <w:i/>
-          <w:iCs/>
-        </w:rPr>
-        <w:t xml:space="preserve"> de glaça</w:t>
-      </w:r>
-      <w:r>
-        <w:t xml:space="preserve"> (Cimes de brume, vallée de glace), le paysage s'habille et se pare noblement de ses éléments naturels.</w:t>
-      </w:r>
-    </w:p>
-    <w:p>
-      <w:pPr>
-        <w:jc w:val="both"/>
-      </w:pPr>
-      <w:r>
-        <w:rPr>
-          <w:b/>
-          <w:bCs/>
-        </w:rPr>
-        <w:t>4. D'un chant descriptif à un texte ancré dans le réel</w:t>
-      </w:r>
-    </w:p>
-    <w:p>
-      <w:pPr>
-        <w:jc w:val="both"/>
-      </w:pPr>
-      <w:r>
-        <w:t>Globalement, le travail a consisté à ancrer les paroles dans le vécu de ses habitants. Les gemmes évoquées (</w:t>
-      </w:r>
-      <w:proofErr w:type="spellStart"/>
-      <w:r>
-        <w:rPr>
-          <w:i/>
-          <w:iCs/>
-        </w:rPr>
-        <w:t>lutz</w:t>
-      </w:r>
-      <w:proofErr w:type="spellEnd"/>
-      <w:r>
-        <w:rPr>
-          <w:i/>
-          <w:iCs/>
-        </w:rPr>
-        <w:t xml:space="preserve"> de saphir</w:t>
-      </w:r>
-      <w:r>
-        <w:t xml:space="preserve">, </w:t>
-      </w:r>
-      <w:proofErr w:type="spellStart"/>
-      <w:r>
-        <w:rPr>
-          <w:i/>
-          <w:iCs/>
-        </w:rPr>
-        <w:t>topazi</w:t>
-      </w:r>
-      <w:proofErr w:type="spellEnd"/>
-      <w:r>
-        <w:rPr>
-          <w:i/>
-          <w:iCs/>
-        </w:rPr>
-        <w:t xml:space="preserve"> </w:t>
-      </w:r>
-      <w:proofErr w:type="spellStart"/>
-      <w:r>
-        <w:rPr>
-          <w:i/>
-          <w:iCs/>
-        </w:rPr>
-        <w:t>clar</w:t>
-      </w:r>
-      <w:proofErr w:type="spellEnd"/>
-      <w:r>
-        <w:t>) ne sont plus de simples cailloux qui brillent dans un torrent, elles sont directement comparées à l'équipement du chevalier ("l'</w:t>
-      </w:r>
-      <w:proofErr w:type="spellStart"/>
-      <w:r>
-        <w:t>òme</w:t>
-      </w:r>
-      <w:proofErr w:type="spellEnd"/>
-      <w:r>
-        <w:t xml:space="preserve"> de </w:t>
-      </w:r>
-      <w:proofErr w:type="spellStart"/>
-      <w:r>
-        <w:t>guèrra</w:t>
-      </w:r>
-      <w:proofErr w:type="spellEnd"/>
-      <w:r>
-        <w:t>") et au regard d'une dame ("coma l'</w:t>
-      </w:r>
-      <w:proofErr w:type="spellStart"/>
-      <w:r>
-        <w:t>uèlh</w:t>
-      </w:r>
-      <w:proofErr w:type="spellEnd"/>
-      <w:r>
-        <w:t xml:space="preserve"> de la </w:t>
-      </w:r>
-      <w:proofErr w:type="spellStart"/>
-      <w:r>
-        <w:t>damaisèla</w:t>
-      </w:r>
-      <w:proofErr w:type="spellEnd"/>
-      <w:r>
-        <w:t>"). La chanson lie désormais intimement les traits de la nature aux valeurs humaines de ceux qui l'habitent.</w:t>
+        <w:t>topazi clar</w:t>
+      </w:r>
+      <w:r>
+        <w:t>) ne sont plus de simples cailloux qui brillent dans un torrent, elles sont directement comparées à l'équipement du chevalier ("l'òme de guèrra") et au regard d'une dame ("coma l'uèlh de la damaisèla"). La chanson lie désormais intimement les traits de la nature aux valeurs humaines de ceux qui l'habitent.</w:t>
       </w:r>
     </w:p>
     <w:p>
@@ -2545,7 +2379,6 @@
         </w:rPr>
         <w:t>L'héraldique (</w:t>
       </w:r>
-      <w:proofErr w:type="spellStart"/>
       <w:r>
         <w:rPr>
           <w:b/>
@@ -2553,17 +2386,7 @@
           <w:i/>
           <w:iCs/>
         </w:rPr>
-        <w:t>L'aur</w:t>
-      </w:r>
-      <w:proofErr w:type="spellEnd"/>
-      <w:r>
-        <w:rPr>
-          <w:b/>
-          <w:bCs/>
-          <w:i/>
-          <w:iCs/>
-        </w:rPr>
-        <w:t xml:space="preserve"> e l'azur</w:t>
+        <w:t>L'aur e l'azur</w:t>
       </w:r>
       <w:r>
         <w:rPr>
@@ -2598,58 +2421,25 @@
           <w:i/>
           <w:iCs/>
         </w:rPr>
-        <w:t xml:space="preserve">Lo </w:t>
-      </w:r>
-      <w:proofErr w:type="spellStart"/>
+        <w:t>Lo vòt es prestat</w:t>
+      </w:r>
       <w:r>
         <w:rPr>
           <w:b/>
           <w:bCs/>
+        </w:rPr>
+        <w:t>) :</w:t>
+      </w:r>
+      <w:r>
+        <w:t xml:space="preserve"> Le verbe </w:t>
+      </w:r>
+      <w:r>
+        <w:rPr>
           <w:i/>
           <w:iCs/>
         </w:rPr>
-        <w:t>vòt</w:t>
-      </w:r>
-      <w:proofErr w:type="spellEnd"/>
-      <w:r>
-        <w:rPr>
-          <w:b/>
-          <w:bCs/>
-          <w:i/>
-          <w:iCs/>
-        </w:rPr>
-        <w:t xml:space="preserve"> es </w:t>
-      </w:r>
-      <w:proofErr w:type="spellStart"/>
-      <w:r>
-        <w:rPr>
-          <w:b/>
-          <w:bCs/>
-          <w:i/>
-          <w:iCs/>
-        </w:rPr>
-        <w:t>prestat</w:t>
-      </w:r>
-      <w:proofErr w:type="spellEnd"/>
-      <w:r>
-        <w:rPr>
-          <w:b/>
-          <w:bCs/>
-        </w:rPr>
-        <w:t>) :</w:t>
-      </w:r>
-      <w:r>
-        <w:t xml:space="preserve"> Le verbe </w:t>
-      </w:r>
-      <w:proofErr w:type="spellStart"/>
-      <w:r>
-        <w:rPr>
-          <w:i/>
-          <w:iCs/>
-        </w:rPr>
         <w:t>prestar</w:t>
       </w:r>
-      <w:proofErr w:type="spellEnd"/>
       <w:r>
         <w:t xml:space="preserve"> (prêter) possède une forte valeur juridique. Il évoque l'hommage lige, l'acte fondateur scellant le contrat d'allégeance indéfectible entre le chevalier, son suzerain et sa terre.</w:t>
       </w:r>
@@ -2669,7 +2459,6 @@
         </w:rPr>
         <w:t>La défense du fief (</w:t>
       </w:r>
-      <w:proofErr w:type="spellStart"/>
       <w:r>
         <w:rPr>
           <w:b/>
@@ -2677,48 +2466,25 @@
           <w:i/>
           <w:iCs/>
         </w:rPr>
-        <w:t>Guardam</w:t>
-      </w:r>
-      <w:proofErr w:type="spellEnd"/>
+        <w:t>Guardam l'enclaus</w:t>
+      </w:r>
       <w:r>
         <w:rPr>
           <w:b/>
           <w:bCs/>
+        </w:rPr>
+        <w:t>) :</w:t>
+      </w:r>
+      <w:r>
+        <w:t xml:space="preserve"> L'</w:t>
+      </w:r>
+      <w:r>
+        <w:rPr>
           <w:i/>
           <w:iCs/>
         </w:rPr>
-        <w:t xml:space="preserve"> l'</w:t>
-      </w:r>
-      <w:proofErr w:type="spellStart"/>
-      <w:r>
-        <w:rPr>
-          <w:b/>
-          <w:bCs/>
-          <w:i/>
-          <w:iCs/>
-        </w:rPr>
         <w:t>enclaus</w:t>
       </w:r>
-      <w:proofErr w:type="spellEnd"/>
-      <w:r>
-        <w:rPr>
-          <w:b/>
-          <w:bCs/>
-        </w:rPr>
-        <w:t>) :</w:t>
-      </w:r>
-      <w:r>
-        <w:t xml:space="preserve"> L'</w:t>
-      </w:r>
-      <w:proofErr w:type="spellStart"/>
-      <w:r>
-        <w:rPr>
-          <w:i/>
-          <w:iCs/>
-        </w:rPr>
-        <w:t>enclaus</w:t>
-      </w:r>
-      <w:proofErr w:type="spellEnd"/>
       <w:r>
         <w:t xml:space="preserve"> désigne un territoire précisément délimité et fermé aux ennemis. Cela rappelle la vocation première de l'homme d'armes : tenir les frontières et protéger son domaine.</w:t>
       </w:r>
@@ -2746,19 +2512,8 @@
           <w:i/>
           <w:iCs/>
         </w:rPr>
-        <w:t xml:space="preserve">Lo </w:t>
-      </w:r>
-      <w:proofErr w:type="spellStart"/>
-      <w:r>
-        <w:rPr>
-          <w:b/>
-          <w:bCs/>
-          <w:i/>
-          <w:iCs/>
-        </w:rPr>
-        <w:t>prètz</w:t>
-      </w:r>
-      <w:proofErr w:type="spellEnd"/>
+        <w:t>Lo prètz</w:t>
+      </w:r>
       <w:r>
         <w:rPr>
           <w:b/>
@@ -2785,7 +2540,6 @@
         </w:rPr>
         <w:t>Une nature bestiale (</w:t>
       </w:r>
-      <w:proofErr w:type="spellStart"/>
       <w:r>
         <w:rPr>
           <w:b/>
@@ -2793,29 +2547,8 @@
           <w:i/>
           <w:iCs/>
         </w:rPr>
-        <w:t>Roncós</w:t>
-      </w:r>
-      <w:proofErr w:type="spellEnd"/>
-      <w:r>
-        <w:rPr>
-          <w:b/>
-          <w:bCs/>
-          <w:i/>
-          <w:iCs/>
-        </w:rPr>
-        <w:t xml:space="preserve"> e </w:t>
-      </w:r>
-      <w:proofErr w:type="spellStart"/>
-      <w:r>
-        <w:rPr>
-          <w:b/>
-          <w:bCs/>
-          <w:i/>
-          <w:iCs/>
-        </w:rPr>
-        <w:t>gronhís</w:t>
-      </w:r>
-      <w:proofErr w:type="spellEnd"/>
+        <w:t>Roncós e gronhís</w:t>
+      </w:r>
       <w:r>
         <w:rPr>
           <w:b/>
@@ -2849,42 +2582,273 @@
           <w:i/>
           <w:iCs/>
         </w:rPr>
-        <w:t>L'</w:t>
-      </w:r>
-      <w:proofErr w:type="spellStart"/>
+        <w:t>L'Altesa</w:t>
+      </w:r>
       <w:r>
         <w:rPr>
           <w:b/>
           <w:bCs/>
+        </w:rPr>
+        <w:t xml:space="preserve"> :</w:t>
+      </w:r>
+      <w:r>
+        <w:t xml:space="preserve"> Ce terme fusionne deux réalités du fief. Au sens géographique, il désigne la haute altitude et les sommets. Au sens féodal, il désigne la noblesse, la grandeur morale et l'exigence du rang ("l'altesse").</w:t>
+      </w:r>
+    </w:p>
+    <w:p>
+      <w:pPr>
+        <w:pStyle w:val="Titre1"/>
+        <w:rPr>
+          <w:lang w:val="en-US"/>
+        </w:rPr>
+      </w:pPr>
+      <w:r>
+        <w:rPr>
+          <w:lang w:val="en-US"/>
+        </w:rPr>
+        <w:t>About the Language and Lyrics</w:t>
+      </w:r>
+    </w:p>
+    <w:p>
+      <w:pPr>
+        <w:jc w:val="both"/>
+        <w:rPr>
+          <w:lang w:val="en-US"/>
+        </w:rPr>
+      </w:pPr>
+      <w:r>
+        <w:rPr>
+          <w:lang w:val="en-US"/>
+        </w:rPr>
+        <w:t>As a reminder, the language of this song is Occitan, and more specifically its Languedocien standard (the classical and central form of the language)!</w:t>
+      </w:r>
+    </w:p>
+    <w:p>
+      <w:pPr>
+        <w:pStyle w:val="Titre2"/>
+        <w:rPr>
+          <w:lang w:val="en-US"/>
+        </w:rPr>
+      </w:pPr>
+      <w:r>
+        <w:rPr>
+          <w:lang w:val="en-US"/>
+        </w:rPr>
+        <w:t>Since Version 2: Refining the Language</w:t>
+      </w:r>
+    </w:p>
+    <w:p>
+      <w:pPr>
+        <w:jc w:val="both"/>
+        <w:rPr>
+          <w:lang w:val="en-US"/>
+        </w:rPr>
+      </w:pPr>
+      <w:r>
+        <w:rPr>
+          <w:lang w:val="en-US"/>
+        </w:rPr>
+        <w:t>While Occitan immediately gives a local and medieval flavor to a song, it still needs to be accurate. Since the previous version (V2), the text has undergone a complete overhaul to move from "generic fantasy" to a true feudal liturgy. We tracked down poetic weaknesses and linguistic aberrations to offer a pure and striking text.</w:t>
+      </w:r>
+    </w:p>
+    <w:p>
+      <w:pPr>
+        <w:jc w:val="both"/>
+        <w:rPr>
+          <w:lang w:val="en-US"/>
+        </w:rPr>
+      </w:pPr>
+      <w:r>
+        <w:rPr>
+          <w:lang w:val="en-US"/>
+        </w:rPr>
+        <w:t>Here are the main focuses of this rewrite:</w:t>
+      </w:r>
+    </w:p>
+    <w:p>
+      <w:pPr>
+        <w:jc w:val="both"/>
+        <w:rPr>
+          <w:lang w:val="en-US"/>
+        </w:rPr>
+      </w:pPr>
+      <w:r>
+        <w:rPr>
+          <w:b/>
+          <w:bCs/>
+          <w:lang w:val="en-US"/>
+        </w:rPr>
+        <w:t>1. The End of Invented Rhymes ("Bronze" and "Gronze")</w:t>
+      </w:r>
+    </w:p>
+    <w:p>
+      <w:pPr>
+        <w:jc w:val="both"/>
+        <w:rPr>
+          <w:lang w:val="en-US"/>
+        </w:rPr>
+      </w:pPr>
+      <w:r>
+        <w:rPr>
+          <w:lang w:val="en-US"/>
+        </w:rPr>
+        <w:t xml:space="preserve">In V2, the second verse tried to rhyme </w:t>
+      </w:r>
+      <w:r>
+        <w:rPr>
           <w:i/>
           <w:iCs/>
-        </w:rPr>
-        <w:t>Altesa</w:t>
-      </w:r>
-      <w:proofErr w:type="spellEnd"/>
+          <w:lang w:val="en-US"/>
+        </w:rPr>
+        <w:t>flama de bronze</w:t>
+      </w:r>
+      <w:r>
+        <w:rPr>
+          <w:lang w:val="en-US"/>
+        </w:rPr>
+        <w:t xml:space="preserve"> (flame of bronze) with the wind that </w:t>
+      </w:r>
+      <w:r>
+        <w:rPr>
+          <w:i/>
+          <w:iCs/>
+          <w:lang w:val="en-US"/>
+        </w:rPr>
+        <w:t>gronze</w:t>
+      </w:r>
+      <w:r>
+        <w:rPr>
+          <w:lang w:val="en-US"/>
+        </w:rPr>
+        <w:t xml:space="preserve">. The problem? Not only is </w:t>
+      </w:r>
+      <w:r>
+        <w:rPr>
+          <w:i/>
+          <w:iCs/>
+          <w:lang w:val="en-US"/>
+        </w:rPr>
+        <w:t>bronze</w:t>
+      </w:r>
+      <w:r>
+        <w:rPr>
+          <w:lang w:val="en-US"/>
+        </w:rPr>
+        <w:t xml:space="preserve"> irrelevant for a mountain forge fire, but the word </w:t>
+      </w:r>
+      <w:r>
+        <w:rPr>
+          <w:i/>
+          <w:iCs/>
+          <w:lang w:val="en-US"/>
+        </w:rPr>
+        <w:t>gronze</w:t>
+      </w:r>
+      <w:r>
+        <w:rPr>
+          <w:lang w:val="en-US"/>
+        </w:rPr>
+        <w:t xml:space="preserve"> simply does not exist in Occitan! It was a completely invented portmanteau word to force a rhyme with </w:t>
+      </w:r>
+      <w:r>
+        <w:rPr>
+          <w:i/>
+          <w:iCs/>
+          <w:lang w:val="en-US"/>
+        </w:rPr>
+        <w:t>gronhir</w:t>
+      </w:r>
+      <w:r>
+        <w:rPr>
+          <w:lang w:val="en-US"/>
+        </w:rPr>
+        <w:t xml:space="preserve"> (to growl). We swept this error away by returning to authentic verbs: the valley </w:t>
+      </w:r>
+      <w:r>
+        <w:rPr>
+          <w:i/>
+          <w:iCs/>
+          <w:lang w:val="en-US"/>
+        </w:rPr>
+        <w:t>ressonhís</w:t>
+      </w:r>
+      <w:r>
+        <w:rPr>
+          <w:lang w:val="en-US"/>
+        </w:rPr>
+        <w:t xml:space="preserve"> (resounds) and the wind </w:t>
+      </w:r>
+      <w:r>
+        <w:rPr>
+          <w:i/>
+          <w:iCs/>
+          <w:lang w:val="en-US"/>
+        </w:rPr>
+        <w:t>gronhís</w:t>
+      </w:r>
+      <w:r>
+        <w:rPr>
+          <w:lang w:val="en-US"/>
+        </w:rPr>
+        <w:t xml:space="preserve"> (growls), creating an infinitely more natural and fierce assonance.</w:t>
+      </w:r>
+    </w:p>
+    <w:p>
+      <w:pPr>
+        <w:jc w:val="both"/>
+        <w:rPr>
+          <w:lang w:val="en-US"/>
+        </w:rPr>
+      </w:pPr>
       <w:r>
         <w:rPr>
           <w:b/>
           <w:bCs/>
-        </w:rPr>
-        <w:t xml:space="preserve"> :</w:t>
-      </w:r>
-      <w:r>
-        <w:t xml:space="preserve"> Ce terme fusionne deux réalités du fief. Au sens géographique, il désigne la haute altitude et les sommets. Au sens féodal, il désigne la noblesse, la grandeur morale et l'exigence du rang ("l'altesse").</w:t>
+          <w:lang w:val="en-US"/>
+        </w:rPr>
+        <w:t>2. Abandoning Absurd Metaphors ("Vira la vèira")</w:t>
       </w:r>
     </w:p>
     <w:p>
       <w:pPr>
-        <w:pStyle w:val="Titre1"/>
-        <w:rPr>
-          <w:lang w:val="en-US"/>
-        </w:rPr>
-      </w:pPr>
-      <w:r>
-        <w:rPr>
-          <w:lang w:val="en-US"/>
-        </w:rPr>
-        <w:t>About the Language and Lyrics</w:t>
+        <w:jc w:val="both"/>
+        <w:rPr>
+          <w:lang w:val="en-US"/>
+        </w:rPr>
+      </w:pPr>
+      <w:r>
+        <w:rPr>
+          <w:lang w:val="en-US"/>
+        </w:rPr>
+        <w:t xml:space="preserve">To describe the flight of the eagle, the old version used the expression </w:t>
+      </w:r>
+      <w:r>
+        <w:rPr>
+          <w:i/>
+          <w:iCs/>
+          <w:lang w:val="en-US"/>
+        </w:rPr>
+        <w:t>vira la vèira</w:t>
+      </w:r>
+      <w:r>
+        <w:rPr>
+          <w:lang w:val="en-US"/>
+        </w:rPr>
+        <w:t xml:space="preserve"> (literally: "turns the glass/window"). It was an obscure phrasing, hardly evocative for a song intended to be clear. We replaced it with an image of careful watchfulness and protection: </w:t>
+      </w:r>
+      <w:r>
+        <w:rPr>
+          <w:i/>
+          <w:iCs/>
+          <w:lang w:val="en-US"/>
+        </w:rPr>
+        <w:t>que las abraça</w:t>
+      </w:r>
+      <w:r>
+        <w:rPr>
+          <w:lang w:val="en-US"/>
+        </w:rPr>
+        <w:t xml:space="preserve"> (which embraces them). The eagle no longer merely soars above the mountains; it envelops the valley within its protective wings. This aerial embrace is not a claim of ownership, but a strong and sturdy gesture, comparable to the arms of a father watching over his family.</w:t>
       </w:r>
     </w:p>
     <w:p>
@@ -2896,37 +2860,53 @@
       </w:pPr>
       <w:r>
         <w:rPr>
-          <w:lang w:val="en-US"/>
-        </w:rPr>
-        <w:t xml:space="preserve">As a reminder, the language of this song is Occitan, and more specifically its </w:t>
-      </w:r>
-      <w:proofErr w:type="spellStart"/>
-      <w:r>
-        <w:rPr>
-          <w:lang w:val="en-US"/>
-        </w:rPr>
-        <w:t>Languedocien</w:t>
-      </w:r>
-      <w:proofErr w:type="spellEnd"/>
-      <w:r>
-        <w:rPr>
-          <w:lang w:val="en-US"/>
-        </w:rPr>
-        <w:t xml:space="preserve"> standard (the classical and central form of the language)!</w:t>
+          <w:b/>
+          <w:bCs/>
+          <w:lang w:val="en-US"/>
+        </w:rPr>
+        <w:t>3. Strengthening the Landscape Descriptions</w:t>
       </w:r>
     </w:p>
     <w:p>
       <w:pPr>
-        <w:pStyle w:val="Titre2"/>
-        <w:rPr>
-          <w:lang w:val="en-US"/>
-        </w:rPr>
-      </w:pPr>
-      <w:r>
-        <w:rPr>
-          <w:lang w:val="en-US"/>
-        </w:rPr>
-        <w:t>Since Version 2: Refining the Language</w:t>
+        <w:jc w:val="both"/>
+        <w:rPr>
+          <w:lang w:val="en-US"/>
+        </w:rPr>
+      </w:pPr>
+      <w:r>
+        <w:rPr>
+          <w:lang w:val="en-US"/>
+        </w:rPr>
+        <w:t xml:space="preserve">The original introduction settled for a somewhat poor and purely descriptive </w:t>
+      </w:r>
+      <w:r>
+        <w:rPr>
+          <w:i/>
+          <w:iCs/>
+          <w:lang w:val="en-US"/>
+        </w:rPr>
+        <w:t>montanhas de pèira</w:t>
+      </w:r>
+      <w:r>
+        <w:rPr>
+          <w:lang w:val="en-US"/>
+        </w:rPr>
+        <w:t xml:space="preserve"> (mountains of stone). By replacing it with the diptych </w:t>
+      </w:r>
+      <w:r>
+        <w:rPr>
+          <w:i/>
+          <w:iCs/>
+          <w:lang w:val="en-US"/>
+        </w:rPr>
+        <w:t>Cimas de nèbla, valh de glaça</w:t>
+      </w:r>
+      <w:r>
+        <w:rPr>
+          <w:lang w:val="en-US"/>
+        </w:rPr>
+        <w:t xml:space="preserve"> (Peaks of mist, valley of ice), the landscape nobly arrays itself in its natural elements.</w:t>
       </w:r>
     </w:p>
     <w:p>
@@ -2938,9 +2918,11 @@
       </w:pPr>
       <w:r>
         <w:rPr>
-          <w:lang w:val="en-US"/>
-        </w:rPr>
-        <w:t>While Occitan immediately gives a local and medieval flavor to a song, it still needs to be accurate. Since the previous version (V2), the text has undergone a complete overhaul to move from "generic fantasy" to a true feudal liturgy. We tracked down poetic weaknesses and linguistic aberrations to offer a pure and striking text.</w:t>
+          <w:b/>
+          <w:bCs/>
+          <w:lang w:val="en-US"/>
+        </w:rPr>
+        <w:t>4. From a Descriptive Song to a Grounded Text</w:t>
       </w:r>
     </w:p>
     <w:p>
@@ -2954,557 +2936,35 @@
         <w:rPr>
           <w:lang w:val="en-US"/>
         </w:rPr>
-        <w:t>Here are the main focuses of this rewrite:</w:t>
-      </w:r>
-    </w:p>
-    <w:p>
-      <w:pPr>
-        <w:jc w:val="both"/>
-        <w:rPr>
-          <w:lang w:val="en-US"/>
-        </w:rPr>
-      </w:pPr>
-      <w:r>
-        <w:rPr>
-          <w:b/>
-          <w:bCs/>
-          <w:lang w:val="en-US"/>
-        </w:rPr>
-        <w:t>1. The End of Invented Rhymes ("Bronze" and "</w:t>
-      </w:r>
-      <w:proofErr w:type="spellStart"/>
-      <w:r>
-        <w:rPr>
-          <w:b/>
-          <w:bCs/>
-          <w:lang w:val="en-US"/>
-        </w:rPr>
-        <w:t>Gronze</w:t>
-      </w:r>
-      <w:proofErr w:type="spellEnd"/>
-      <w:r>
-        <w:rPr>
-          <w:b/>
-          <w:bCs/>
-          <w:lang w:val="en-US"/>
-        </w:rPr>
-        <w:t>")</w:t>
-      </w:r>
-    </w:p>
-    <w:p>
-      <w:pPr>
-        <w:jc w:val="both"/>
-        <w:rPr>
-          <w:lang w:val="en-US"/>
-        </w:rPr>
-      </w:pPr>
-      <w:r>
-        <w:rPr>
-          <w:lang w:val="en-US"/>
-        </w:rPr>
-        <w:t xml:space="preserve">In V2, the second verse tried to rhyme </w:t>
-      </w:r>
-      <w:proofErr w:type="spellStart"/>
+        <w:t>Overall, the work consisted of anchoring the lyrics in the lived experience of its inhabitants. The evoked gems (</w:t>
+      </w:r>
       <w:r>
         <w:rPr>
           <w:i/>
           <w:iCs/>
           <w:lang w:val="en-US"/>
         </w:rPr>
-        <w:t>flama</w:t>
-      </w:r>
-      <w:proofErr w:type="spellEnd"/>
+        <w:t>lutz de saphir</w:t>
+      </w:r>
+      <w:r>
+        <w:rPr>
+          <w:lang w:val="en-US"/>
+        </w:rPr>
+        <w:t xml:space="preserve">, </w:t>
+      </w:r>
       <w:r>
         <w:rPr>
           <w:i/>
           <w:iCs/>
           <w:lang w:val="en-US"/>
         </w:rPr>
-        <w:t xml:space="preserve"> de bronze</w:t>
-      </w:r>
-      <w:r>
-        <w:rPr>
-          <w:lang w:val="en-US"/>
-        </w:rPr>
-        <w:t xml:space="preserve"> (flame of bronze) with the wind that </w:t>
-      </w:r>
-      <w:proofErr w:type="spellStart"/>
-      <w:r>
-        <w:rPr>
-          <w:i/>
-          <w:iCs/>
-          <w:lang w:val="en-US"/>
-        </w:rPr>
-        <w:t>gronze</w:t>
-      </w:r>
-      <w:proofErr w:type="spellEnd"/>
-      <w:r>
-        <w:rPr>
-          <w:lang w:val="en-US"/>
-        </w:rPr>
-        <w:t xml:space="preserve">. The problem? Not only is </w:t>
-      </w:r>
-      <w:r>
-        <w:rPr>
-          <w:i/>
-          <w:iCs/>
-          <w:lang w:val="en-US"/>
-        </w:rPr>
-        <w:t>bronze</w:t>
-      </w:r>
-      <w:r>
-        <w:rPr>
-          <w:lang w:val="en-US"/>
-        </w:rPr>
-        <w:t xml:space="preserve"> irrelevant for a mountain forge fire, but the word </w:t>
-      </w:r>
-      <w:proofErr w:type="spellStart"/>
-      <w:r>
-        <w:rPr>
-          <w:i/>
-          <w:iCs/>
-          <w:lang w:val="en-US"/>
-        </w:rPr>
-        <w:t>gronze</w:t>
-      </w:r>
-      <w:proofErr w:type="spellEnd"/>
-      <w:r>
-        <w:rPr>
-          <w:lang w:val="en-US"/>
-        </w:rPr>
-        <w:t xml:space="preserve"> simply does not exist in Occitan! It was a completely invented portmanteau word to force a rhyme with </w:t>
-      </w:r>
-      <w:proofErr w:type="spellStart"/>
-      <w:r>
-        <w:rPr>
-          <w:i/>
-          <w:iCs/>
-          <w:lang w:val="en-US"/>
-        </w:rPr>
-        <w:t>gronhir</w:t>
-      </w:r>
-      <w:proofErr w:type="spellEnd"/>
-      <w:r>
-        <w:rPr>
-          <w:lang w:val="en-US"/>
-        </w:rPr>
-        <w:t xml:space="preserve"> (to growl). We swept this error away by returning to authentic verbs: the valley </w:t>
-      </w:r>
-      <w:proofErr w:type="spellStart"/>
-      <w:r>
-        <w:rPr>
-          <w:i/>
-          <w:iCs/>
-          <w:lang w:val="en-US"/>
-        </w:rPr>
-        <w:t>ressonhís</w:t>
-      </w:r>
-      <w:proofErr w:type="spellEnd"/>
-      <w:r>
-        <w:rPr>
-          <w:lang w:val="en-US"/>
-        </w:rPr>
-        <w:t xml:space="preserve"> (resounds) and the wind </w:t>
-      </w:r>
-      <w:proofErr w:type="spellStart"/>
-      <w:r>
-        <w:rPr>
-          <w:i/>
-          <w:iCs/>
-          <w:lang w:val="en-US"/>
-        </w:rPr>
-        <w:t>gronhís</w:t>
-      </w:r>
-      <w:proofErr w:type="spellEnd"/>
-      <w:r>
-        <w:rPr>
-          <w:lang w:val="en-US"/>
-        </w:rPr>
-        <w:t xml:space="preserve"> (growls), creating an infinitely more natural and fierce assonance.</w:t>
-      </w:r>
-    </w:p>
-    <w:p>
-      <w:pPr>
-        <w:jc w:val="both"/>
-        <w:rPr>
-          <w:lang w:val="en-US"/>
-        </w:rPr>
-      </w:pPr>
-      <w:r>
-        <w:rPr>
-          <w:b/>
-          <w:bCs/>
-          <w:lang w:val="en-US"/>
-        </w:rPr>
-        <w:t xml:space="preserve">2. Abandoning Absurd Metaphors ("Vira la </w:t>
-      </w:r>
-      <w:proofErr w:type="spellStart"/>
-      <w:r>
-        <w:rPr>
-          <w:b/>
-          <w:bCs/>
-          <w:lang w:val="en-US"/>
-        </w:rPr>
-        <w:t>vèira</w:t>
-      </w:r>
-      <w:proofErr w:type="spellEnd"/>
-      <w:r>
-        <w:rPr>
-          <w:b/>
-          <w:bCs/>
-          <w:lang w:val="en-US"/>
-        </w:rPr>
-        <w:t>")</w:t>
-      </w:r>
-    </w:p>
-    <w:p>
-      <w:pPr>
-        <w:jc w:val="both"/>
-        <w:rPr>
-          <w:lang w:val="en-US"/>
-        </w:rPr>
-      </w:pPr>
-      <w:r>
-        <w:rPr>
-          <w:lang w:val="en-US"/>
-        </w:rPr>
-        <w:t xml:space="preserve">To describe the flight of the eagle, the old version used the expression </w:t>
-      </w:r>
-      <w:proofErr w:type="spellStart"/>
-      <w:r>
-        <w:rPr>
-          <w:i/>
-          <w:iCs/>
-          <w:lang w:val="en-US"/>
-        </w:rPr>
-        <w:t>vira</w:t>
-      </w:r>
-      <w:proofErr w:type="spellEnd"/>
-      <w:r>
-        <w:rPr>
-          <w:i/>
-          <w:iCs/>
-          <w:lang w:val="en-US"/>
-        </w:rPr>
-        <w:t xml:space="preserve"> la </w:t>
-      </w:r>
-      <w:proofErr w:type="spellStart"/>
-      <w:r>
-        <w:rPr>
-          <w:i/>
-          <w:iCs/>
-          <w:lang w:val="en-US"/>
-        </w:rPr>
-        <w:t>vèira</w:t>
-      </w:r>
-      <w:proofErr w:type="spellEnd"/>
-      <w:r>
-        <w:rPr>
-          <w:lang w:val="en-US"/>
-        </w:rPr>
-        <w:t xml:space="preserve"> (literally: "turns the glass/window"). It was an obscure phrasing, hardly evocative for a song intended to be clear. We replaced it with an image of careful watchfulness and protection: </w:t>
-      </w:r>
-      <w:proofErr w:type="spellStart"/>
-      <w:r>
-        <w:rPr>
-          <w:i/>
-          <w:iCs/>
-          <w:lang w:val="en-US"/>
-        </w:rPr>
-        <w:t>que</w:t>
-      </w:r>
-      <w:proofErr w:type="spellEnd"/>
-      <w:r>
-        <w:rPr>
-          <w:i/>
-          <w:iCs/>
-          <w:lang w:val="en-US"/>
-        </w:rPr>
-        <w:t xml:space="preserve"> las </w:t>
-      </w:r>
-      <w:proofErr w:type="spellStart"/>
-      <w:r>
-        <w:rPr>
-          <w:i/>
-          <w:iCs/>
-          <w:lang w:val="en-US"/>
-        </w:rPr>
-        <w:t>abraça</w:t>
-      </w:r>
-      <w:proofErr w:type="spellEnd"/>
-      <w:r>
-        <w:rPr>
-          <w:lang w:val="en-US"/>
-        </w:rPr>
-        <w:t xml:space="preserve"> (which embraces them). The eagle no longer merely soars above the mountains; it envelops the valley within its protective wings. This aerial embrace is not a claim of ownership, but a strong and sturdy gesture, comparable to the arms of a father watching over his family.</w:t>
-      </w:r>
-    </w:p>
-    <w:p>
-      <w:pPr>
-        <w:jc w:val="both"/>
-        <w:rPr>
-          <w:lang w:val="en-US"/>
-        </w:rPr>
-      </w:pPr>
-      <w:r>
-        <w:rPr>
-          <w:b/>
-          <w:bCs/>
-          <w:lang w:val="en-US"/>
-        </w:rPr>
-        <w:t>3. Strengthening the Landscape Descriptions</w:t>
-      </w:r>
-    </w:p>
-    <w:p>
-      <w:pPr>
-        <w:jc w:val="both"/>
-        <w:rPr>
-          <w:lang w:val="en-US"/>
-        </w:rPr>
-      </w:pPr>
-      <w:r>
-        <w:rPr>
-          <w:lang w:val="en-US"/>
-        </w:rPr>
-        <w:t xml:space="preserve">The original introduction settled for a somewhat poor and purely descriptive </w:t>
-      </w:r>
-      <w:proofErr w:type="spellStart"/>
-      <w:r>
-        <w:rPr>
-          <w:i/>
-          <w:iCs/>
-          <w:lang w:val="en-US"/>
-        </w:rPr>
-        <w:t>montanhas</w:t>
-      </w:r>
-      <w:proofErr w:type="spellEnd"/>
-      <w:r>
-        <w:rPr>
-          <w:i/>
-          <w:iCs/>
-          <w:lang w:val="en-US"/>
-        </w:rPr>
-        <w:t xml:space="preserve"> de </w:t>
-      </w:r>
-      <w:proofErr w:type="spellStart"/>
-      <w:r>
-        <w:rPr>
-          <w:i/>
-          <w:iCs/>
-          <w:lang w:val="en-US"/>
-        </w:rPr>
-        <w:t>pèira</w:t>
-      </w:r>
-      <w:proofErr w:type="spellEnd"/>
-      <w:r>
-        <w:rPr>
-          <w:lang w:val="en-US"/>
-        </w:rPr>
-        <w:t xml:space="preserve"> (mountains of stone). By replacing it with the diptych </w:t>
-      </w:r>
-      <w:r>
-        <w:rPr>
-          <w:i/>
-          <w:iCs/>
-          <w:lang w:val="en-US"/>
-        </w:rPr>
-        <w:t xml:space="preserve">Cimas de </w:t>
-      </w:r>
-      <w:proofErr w:type="spellStart"/>
-      <w:r>
-        <w:rPr>
-          <w:i/>
-          <w:iCs/>
-          <w:lang w:val="en-US"/>
-        </w:rPr>
-        <w:t>nèbla</w:t>
-      </w:r>
-      <w:proofErr w:type="spellEnd"/>
-      <w:r>
-        <w:rPr>
-          <w:i/>
-          <w:iCs/>
-          <w:lang w:val="en-US"/>
-        </w:rPr>
-        <w:t xml:space="preserve">, </w:t>
-      </w:r>
-      <w:proofErr w:type="spellStart"/>
-      <w:r>
-        <w:rPr>
-          <w:i/>
-          <w:iCs/>
-          <w:lang w:val="en-US"/>
-        </w:rPr>
-        <w:t>valh</w:t>
-      </w:r>
-      <w:proofErr w:type="spellEnd"/>
-      <w:r>
-        <w:rPr>
-          <w:i/>
-          <w:iCs/>
-          <w:lang w:val="en-US"/>
-        </w:rPr>
-        <w:t xml:space="preserve"> de </w:t>
-      </w:r>
-      <w:proofErr w:type="spellStart"/>
-      <w:r>
-        <w:rPr>
-          <w:i/>
-          <w:iCs/>
-          <w:lang w:val="en-US"/>
-        </w:rPr>
-        <w:t>glaça</w:t>
-      </w:r>
-      <w:proofErr w:type="spellEnd"/>
-      <w:r>
-        <w:rPr>
-          <w:lang w:val="en-US"/>
-        </w:rPr>
-        <w:t xml:space="preserve"> (Peaks of mist, valley of ice), the landscape nobly arrays itself in its natural elements.</w:t>
-      </w:r>
-    </w:p>
-    <w:p>
-      <w:pPr>
-        <w:jc w:val="both"/>
-        <w:rPr>
-          <w:lang w:val="en-US"/>
-        </w:rPr>
-      </w:pPr>
-      <w:r>
-        <w:rPr>
-          <w:b/>
-          <w:bCs/>
-          <w:lang w:val="en-US"/>
-        </w:rPr>
-        <w:t>4. From a Descriptive Song to a Grounded Text</w:t>
-      </w:r>
-    </w:p>
-    <w:p>
-      <w:pPr>
-        <w:jc w:val="both"/>
-        <w:rPr>
-          <w:lang w:val="en-US"/>
-        </w:rPr>
-      </w:pPr>
-      <w:r>
-        <w:rPr>
-          <w:lang w:val="en-US"/>
-        </w:rPr>
-        <w:t>Overall, the work consisted of anchoring the lyrics in the lived experience of its inhabitants. The evoked gems (</w:t>
-      </w:r>
-      <w:r>
-        <w:rPr>
-          <w:i/>
-          <w:iCs/>
-          <w:lang w:val="en-US"/>
-        </w:rPr>
-        <w:t xml:space="preserve">lutz de </w:t>
-      </w:r>
-      <w:proofErr w:type="spellStart"/>
-      <w:r>
-        <w:rPr>
-          <w:i/>
-          <w:iCs/>
-          <w:lang w:val="en-US"/>
-        </w:rPr>
-        <w:t>saphir</w:t>
-      </w:r>
-      <w:proofErr w:type="spellEnd"/>
-      <w:r>
-        <w:rPr>
-          <w:lang w:val="en-US"/>
-        </w:rPr>
-        <w:t xml:space="preserve">, </w:t>
-      </w:r>
-      <w:proofErr w:type="spellStart"/>
-      <w:r>
-        <w:rPr>
-          <w:i/>
-          <w:iCs/>
-          <w:lang w:val="en-US"/>
-        </w:rPr>
-        <w:t>topazi</w:t>
-      </w:r>
-      <w:proofErr w:type="spellEnd"/>
-      <w:r>
-        <w:rPr>
-          <w:i/>
-          <w:iCs/>
-          <w:lang w:val="en-US"/>
-        </w:rPr>
-        <w:t xml:space="preserve"> </w:t>
-      </w:r>
-      <w:proofErr w:type="spellStart"/>
-      <w:r>
-        <w:rPr>
-          <w:i/>
-          <w:iCs/>
-          <w:lang w:val="en-US"/>
-        </w:rPr>
-        <w:t>clar</w:t>
-      </w:r>
-      <w:proofErr w:type="spellEnd"/>
-      <w:r>
-        <w:rPr>
-          <w:lang w:val="en-US"/>
-        </w:rPr>
-        <w:t>) are no longer simple pebbles shining in a torrent; they are directly compared to the knight's equipment ("</w:t>
-      </w:r>
-      <w:proofErr w:type="spellStart"/>
-      <w:r>
-        <w:rPr>
-          <w:lang w:val="en-US"/>
-        </w:rPr>
-        <w:t>l'òme</w:t>
-      </w:r>
-      <w:proofErr w:type="spellEnd"/>
-      <w:r>
-        <w:rPr>
-          <w:lang w:val="en-US"/>
-        </w:rPr>
-        <w:t xml:space="preserve"> de </w:t>
-      </w:r>
-      <w:proofErr w:type="spellStart"/>
-      <w:r>
-        <w:rPr>
-          <w:lang w:val="en-US"/>
-        </w:rPr>
-        <w:t>guèrra</w:t>
-      </w:r>
-      <w:proofErr w:type="spellEnd"/>
-      <w:r>
-        <w:rPr>
-          <w:lang w:val="en-US"/>
-        </w:rPr>
-        <w:t xml:space="preserve">") and to a lady's gaze ("coma </w:t>
-      </w:r>
-      <w:proofErr w:type="spellStart"/>
-      <w:r>
-        <w:rPr>
-          <w:lang w:val="en-US"/>
-        </w:rPr>
-        <w:t>l'uèlh</w:t>
-      </w:r>
-      <w:proofErr w:type="spellEnd"/>
-      <w:r>
-        <w:rPr>
-          <w:lang w:val="en-US"/>
-        </w:rPr>
-        <w:t xml:space="preserve"> de la </w:t>
-      </w:r>
-      <w:proofErr w:type="spellStart"/>
-      <w:r>
-        <w:rPr>
-          <w:lang w:val="en-US"/>
-        </w:rPr>
-        <w:t>damaisèla</w:t>
-      </w:r>
-      <w:proofErr w:type="spellEnd"/>
-      <w:r>
-        <w:rPr>
-          <w:lang w:val="en-US"/>
-        </w:rPr>
-        <w:t>"). The song now intimately links the features of nature to the human values of those who inhabit it.</w:t>
+        <w:t>topazi clar</w:t>
+      </w:r>
+      <w:r>
+        <w:rPr>
+          <w:lang w:val="en-US"/>
+        </w:rPr>
+        <w:t>) are no longer simple pebbles shining in a torrent; they are directly compared to the knight's equipment ("l'òme de guèrra") and to a lady's gaze ("coma l'uèlh de la damaisèla"). The song now intimately links the features of nature to the human values of those who inhabit it.</w:t>
       </w:r>
     </w:p>
     <w:p>
@@ -3541,7 +3001,6 @@
         </w:rPr>
         <w:t>Heraldry (</w:t>
       </w:r>
-      <w:proofErr w:type="spellStart"/>
       <w:r>
         <w:rPr>
           <w:b/>
@@ -3550,31 +3009,8 @@
           <w:iCs/>
           <w:lang w:val="en-US"/>
         </w:rPr>
-        <w:t>L'aur</w:t>
-      </w:r>
-      <w:proofErr w:type="spellEnd"/>
-      <w:r>
-        <w:rPr>
-          <w:b/>
-          <w:bCs/>
-          <w:i/>
-          <w:iCs/>
-          <w:lang w:val="en-US"/>
-        </w:rPr>
-        <w:t xml:space="preserve"> e </w:t>
-      </w:r>
-      <w:proofErr w:type="spellStart"/>
-      <w:r>
-        <w:rPr>
-          <w:b/>
-          <w:bCs/>
-          <w:i/>
-          <w:iCs/>
-          <w:lang w:val="en-US"/>
-        </w:rPr>
-        <w:t>l'azur</w:t>
-      </w:r>
-      <w:proofErr w:type="spellEnd"/>
+        <w:t>L'aur e l'azur</w:t>
+      </w:r>
       <w:r>
         <w:rPr>
           <w:b/>
@@ -3617,66 +3053,30 @@
           <w:iCs/>
           <w:lang w:val="en-US"/>
         </w:rPr>
-        <w:t xml:space="preserve">Lo </w:t>
-      </w:r>
-      <w:proofErr w:type="spellStart"/>
+        <w:t>Lo vòt es prestat</w:t>
+      </w:r>
       <w:r>
         <w:rPr>
           <w:b/>
           <w:bCs/>
+          <w:lang w:val="en-US"/>
+        </w:rPr>
+        <w:t>):</w:t>
+      </w:r>
+      <w:r>
+        <w:rPr>
+          <w:lang w:val="en-US"/>
+        </w:rPr>
+        <w:t xml:space="preserve"> The verb </w:t>
+      </w:r>
+      <w:r>
+        <w:rPr>
           <w:i/>
           <w:iCs/>
           <w:lang w:val="en-US"/>
         </w:rPr>
-        <w:t>vòt</w:t>
-      </w:r>
-      <w:proofErr w:type="spellEnd"/>
-      <w:r>
-        <w:rPr>
-          <w:b/>
-          <w:bCs/>
-          <w:i/>
-          <w:iCs/>
-          <w:lang w:val="en-US"/>
-        </w:rPr>
-        <w:t xml:space="preserve"> es </w:t>
-      </w:r>
-      <w:proofErr w:type="spellStart"/>
-      <w:r>
-        <w:rPr>
-          <w:b/>
-          <w:bCs/>
-          <w:i/>
-          <w:iCs/>
-          <w:lang w:val="en-US"/>
-        </w:rPr>
-        <w:t>prestat</w:t>
-      </w:r>
-      <w:proofErr w:type="spellEnd"/>
-      <w:r>
-        <w:rPr>
-          <w:b/>
-          <w:bCs/>
-          <w:lang w:val="en-US"/>
-        </w:rPr>
-        <w:t>):</w:t>
-      </w:r>
-      <w:r>
-        <w:rPr>
-          <w:lang w:val="en-US"/>
-        </w:rPr>
-        <w:t xml:space="preserve"> The verb </w:t>
-      </w:r>
-      <w:proofErr w:type="spellStart"/>
-      <w:r>
-        <w:rPr>
-          <w:i/>
-          <w:iCs/>
-          <w:lang w:val="en-US"/>
-        </w:rPr>
         <w:t>prestar</w:t>
       </w:r>
-      <w:proofErr w:type="spellEnd"/>
       <w:r>
         <w:rPr>
           <w:lang w:val="en-US"/>
@@ -3703,7 +3103,6 @@
         </w:rPr>
         <w:t>Defense of the Fief (</w:t>
       </w:r>
-      <w:proofErr w:type="spellStart"/>
       <w:r>
         <w:rPr>
           <w:b/>
@@ -3712,55 +3111,30 @@
           <w:iCs/>
           <w:lang w:val="en-US"/>
         </w:rPr>
-        <w:t>Guardam</w:t>
-      </w:r>
-      <w:proofErr w:type="spellEnd"/>
+        <w:t>Guardam l'enclaus</w:t>
+      </w:r>
       <w:r>
         <w:rPr>
           <w:b/>
           <w:bCs/>
+          <w:lang w:val="en-US"/>
+        </w:rPr>
+        <w:t>):</w:t>
+      </w:r>
+      <w:r>
+        <w:rPr>
+          <w:lang w:val="en-US"/>
+        </w:rPr>
+        <w:t xml:space="preserve"> The </w:t>
+      </w:r>
+      <w:r>
+        <w:rPr>
           <w:i/>
           <w:iCs/>
           <w:lang w:val="en-US"/>
         </w:rPr>
-        <w:t xml:space="preserve"> </w:t>
-      </w:r>
-      <w:proofErr w:type="spellStart"/>
-      <w:r>
-        <w:rPr>
-          <w:b/>
-          <w:bCs/>
-          <w:i/>
-          <w:iCs/>
-          <w:lang w:val="en-US"/>
-        </w:rPr>
-        <w:t>l'enclaus</w:t>
-      </w:r>
-      <w:proofErr w:type="spellEnd"/>
-      <w:r>
-        <w:rPr>
-          <w:b/>
-          <w:bCs/>
-          <w:lang w:val="en-US"/>
-        </w:rPr>
-        <w:t>):</w:t>
-      </w:r>
-      <w:r>
-        <w:rPr>
-          <w:lang w:val="en-US"/>
-        </w:rPr>
-        <w:t xml:space="preserve"> The </w:t>
-      </w:r>
-      <w:proofErr w:type="spellStart"/>
-      <w:r>
-        <w:rPr>
-          <w:i/>
-          <w:iCs/>
-          <w:lang w:val="en-US"/>
-        </w:rPr>
         <w:t>enclaus</w:t>
       </w:r>
-      <w:proofErr w:type="spellEnd"/>
       <w:r>
         <w:rPr>
           <w:lang w:val="en-US"/>
@@ -3795,20 +3169,8 @@
           <w:iCs/>
           <w:lang w:val="en-US"/>
         </w:rPr>
-        <w:t xml:space="preserve">Lo </w:t>
-      </w:r>
-      <w:proofErr w:type="spellStart"/>
-      <w:r>
-        <w:rPr>
-          <w:b/>
-          <w:bCs/>
-          <w:i/>
-          <w:iCs/>
-          <w:lang w:val="en-US"/>
-        </w:rPr>
-        <w:t>prètz</w:t>
-      </w:r>
-      <w:proofErr w:type="spellEnd"/>
+        <w:t>Lo prètz</w:t>
+      </w:r>
       <w:r>
         <w:rPr>
           <w:b/>
@@ -3843,7 +3205,6 @@
         </w:rPr>
         <w:t>A Bestial Nature (</w:t>
       </w:r>
-      <w:proofErr w:type="spellStart"/>
       <w:r>
         <w:rPr>
           <w:b/>
@@ -3852,31 +3213,8 @@
           <w:iCs/>
           <w:lang w:val="en-US"/>
         </w:rPr>
-        <w:t>Roncós</w:t>
-      </w:r>
-      <w:proofErr w:type="spellEnd"/>
-      <w:r>
-        <w:rPr>
-          <w:b/>
-          <w:bCs/>
-          <w:i/>
-          <w:iCs/>
-          <w:lang w:val="en-US"/>
-        </w:rPr>
-        <w:t xml:space="preserve"> e </w:t>
-      </w:r>
-      <w:proofErr w:type="spellStart"/>
-      <w:r>
-        <w:rPr>
-          <w:b/>
-          <w:bCs/>
-          <w:i/>
-          <w:iCs/>
-          <w:lang w:val="en-US"/>
-        </w:rPr>
-        <w:t>gronhís</w:t>
-      </w:r>
-      <w:proofErr w:type="spellEnd"/>
+        <w:t>Roncós e gronhís</w:t>
+      </w:r>
       <w:r>
         <w:rPr>
           <w:b/>
@@ -3911,7 +3249,6 @@
         </w:rPr>
         <w:t xml:space="preserve">The Double Meaning of </w:t>
       </w:r>
-      <w:proofErr w:type="spellStart"/>
       <w:r>
         <w:rPr>
           <w:b/>
@@ -3922,7 +3259,6 @@
         </w:rPr>
         <w:t>L'Altesa</w:t>
       </w:r>
-      <w:proofErr w:type="spellEnd"/>
       <w:r>
         <w:rPr>
           <w:b/>
@@ -9957,6 +9293,7 @@
   <w:style w:type="character" w:default="1" w:styleId="Policepardfaut">
     <w:name w:val="Default Paragraph Font"/>
     <w:uiPriority w:val="1"/>
+    <w:semiHidden/>
     <w:unhideWhenUsed/>
   </w:style>
   <w:style w:type="table" w:default="1" w:styleId="TableauNormal">

</xml_diff>